<commit_message>
docs: explicacion de Respaldar carpeta vs Respaldar datos ahora
</commit_message>
<xml_diff>
--- a/PawOS_Manual_Usuario.docx
+++ b/PawOS_Manual_Usuario.docx
@@ -6252,7 +6252,7 @@
           <w:sz w:val="26"/>
           <w:szCs w:val="26"/>
         </w:rPr>
-        <w:t xml:space="preserve">Respaldo de los datos del refugio (PawOS Archivos)</w:t>
+        <w:t xml:space="preserve">Respaldos en PawOS Archivos</w:t>
       </w:r>
     </w:p>
     <w:p>
@@ -6263,49 +6263,492 @@
         <w:rPr>
           <w:rFonts w:ascii="Arial" w:cs="Arial" w:eastAsia="Arial" w:hAnsi="Arial"/>
         </w:rPr>
-        <w:t xml:space="preserve">Desde </w:t>
-      </w:r>
-      <w:r>
-        <w:rPr>
-          <w:rFonts w:ascii="Arial" w:cs="Arial" w:eastAsia="Arial" w:hAnsi="Arial"/>
-          <w:b/>
-          <w:bCs/>
-        </w:rPr>
-        <w:t xml:space="preserve">PawOS Archivos</w:t>
-      </w:r>
-      <w:r>
-        <w:rPr>
-          <w:rFonts w:ascii="Arial" w:cs="Arial" w:eastAsia="Arial" w:hAnsi="Arial"/>
-        </w:rPr>
-        <w:t xml:space="preserve">, el botón </w:t>
-      </w:r>
-      <w:r>
-        <w:rPr>
-          <w:rFonts w:ascii="Arial" w:cs="Arial" w:eastAsia="Arial" w:hAnsi="Arial"/>
-          <w:b/>
-          <w:bCs/>
-        </w:rPr>
-        <w:t xml:space="preserve">Respaldar datos ahora</w:t>
-      </w:r>
-      <w:r>
-        <w:rPr>
-          <w:rFonts w:ascii="Arial" w:cs="Arial" w:eastAsia="Arial" w:hAnsi="Arial"/>
-        </w:rPr>
-        <w:t xml:space="preserve"> guarda una copia de las tablas de datos (mascotas, vacunas, adopciones, clientes, donantes…) como archivos CSV, </w:t>
-      </w:r>
-      <w:r>
-        <w:rPr>
-          <w:rFonts w:ascii="Arial" w:cs="Arial" w:eastAsia="Arial" w:hAnsi="Arial"/>
-          <w:b/>
-          <w:bCs/>
-        </w:rPr>
-        <w:t xml:space="preserve">junto con las fotos de las mascotas</w:t>
-      </w:r>
-      <w:r>
-        <w:rPr>
-          <w:rFonts w:ascii="Arial" w:cs="Arial" w:eastAsia="Arial" w:hAnsi="Arial"/>
-        </w:rPr>
-        <w:t xml:space="preserve">, y deja constancia del respaldo en el registro. Conviene guardar una copia de esos respaldos </w:t>
+        <w:t xml:space="preserve">PawOS Archivos tiene </w:t>
+      </w:r>
+      <w:r>
+        <w:rPr>
+          <w:rFonts w:ascii="Arial" w:cs="Arial" w:eastAsia="Arial" w:hAnsi="Arial"/>
+          <w:b/>
+          <w:bCs/>
+        </w:rPr>
+        <w:t xml:space="preserve">dos botones de respaldo</w:t>
+      </w:r>
+      <w:r>
+        <w:rPr>
+          <w:rFonts w:ascii="Arial" w:cs="Arial" w:eastAsia="Arial" w:hAnsi="Arial"/>
+        </w:rPr>
+        <w:t xml:space="preserve"> que sirven para cosas distintas. Se ven abajo a la derecha de la ventana. Las explicamos con detalle en la sección 13.</w:t>
+      </w:r>
+    </w:p>
+    <w:tbl>
+      <w:tblPr>
+        <w:tblW w:type="dxa" w:w="9360"/>
+        <w:tblBorders>
+          <w:top w:val="single" w:color="auto" w:sz="4"/>
+          <w:left w:val="single" w:color="auto" w:sz="4"/>
+          <w:bottom w:val="single" w:color="auto" w:sz="4"/>
+          <w:right w:val="single" w:color="auto" w:sz="4"/>
+          <w:insideH w:val="single" w:color="auto" w:sz="4"/>
+          <w:insideV w:val="single" w:color="auto" w:sz="4"/>
+        </w:tblBorders>
+      </w:tblPr>
+      <w:tblGrid>
+        <w:gridCol w:w="2300"/>
+        <w:gridCol w:w="3530"/>
+        <w:gridCol w:w="3530"/>
+      </w:tblGrid>
+      <w:tr>
+        <w:trPr>
+          <w:tblHeader/>
+        </w:trPr>
+        <w:tc>
+          <w:tcPr>
+            <w:tcW w:type="dxa" w:w="2300"/>
+            <w:tcBorders>
+              <w:top w:val="single" w:color="C9D6CC" w:sz="4"/>
+              <w:left w:val="single" w:color="C9D6CC" w:sz="4"/>
+              <w:bottom w:val="single" w:color="C9D6CC" w:sz="4"/>
+              <w:right w:val="single" w:color="C9D6CC" w:sz="4"/>
+            </w:tcBorders>
+            <w:shd w:fill="1D7A3E" w:val="clear"/>
+            <w:tcMar>
+              <w:top w:type="dxa" w:w="70"/>
+              <w:left w:type="dxa" w:w="110"/>
+              <w:bottom w:type="dxa" w:w="70"/>
+              <w:right w:type="dxa" w:w="110"/>
+            </w:tcMar>
+          </w:tcPr>
+          <w:p>
+            <w:pPr>
+              <w:spacing w:after="0" w:line="252"/>
+            </w:pPr>
+          </w:p>
+        </w:tc>
+        <w:tc>
+          <w:tcPr>
+            <w:tcW w:type="dxa" w:w="3530"/>
+            <w:tcBorders>
+              <w:top w:val="single" w:color="C9D6CC" w:sz="4"/>
+              <w:left w:val="single" w:color="C9D6CC" w:sz="4"/>
+              <w:bottom w:val="single" w:color="C9D6CC" w:sz="4"/>
+              <w:right w:val="single" w:color="C9D6CC" w:sz="4"/>
+            </w:tcBorders>
+            <w:shd w:fill="1D7A3E" w:val="clear"/>
+            <w:tcMar>
+              <w:top w:type="dxa" w:w="70"/>
+              <w:left w:type="dxa" w:w="110"/>
+              <w:bottom w:type="dxa" w:w="70"/>
+              <w:right w:type="dxa" w:w="110"/>
+            </w:tcMar>
+          </w:tcPr>
+          <w:p>
+            <w:pPr>
+              <w:spacing w:after="0" w:line="252"/>
+            </w:pPr>
+            <w:r>
+              <w:rPr>
+                <w:rFonts w:ascii="Arial" w:cs="Arial" w:eastAsia="Arial" w:hAnsi="Arial"/>
+                <w:b/>
+                <w:bCs/>
+                <w:color w:val="FFFFFF"/>
+                <w:sz w:val="20"/>
+                <w:szCs w:val="20"/>
+              </w:rPr>
+              <w:t xml:space="preserve">Respaldar carpeta</w:t>
+            </w:r>
+          </w:p>
+        </w:tc>
+        <w:tc>
+          <w:tcPr>
+            <w:tcW w:type="dxa" w:w="3530"/>
+            <w:tcBorders>
+              <w:top w:val="single" w:color="C9D6CC" w:sz="4"/>
+              <w:left w:val="single" w:color="C9D6CC" w:sz="4"/>
+              <w:bottom w:val="single" w:color="C9D6CC" w:sz="4"/>
+              <w:right w:val="single" w:color="C9D6CC" w:sz="4"/>
+            </w:tcBorders>
+            <w:shd w:fill="1D7A3E" w:val="clear"/>
+            <w:tcMar>
+              <w:top w:type="dxa" w:w="70"/>
+              <w:left w:type="dxa" w:w="110"/>
+              <w:bottom w:type="dxa" w:w="70"/>
+              <w:right w:type="dxa" w:w="110"/>
+            </w:tcMar>
+          </w:tcPr>
+          <w:p>
+            <w:pPr>
+              <w:spacing w:after="0" w:line="252"/>
+            </w:pPr>
+            <w:r>
+              <w:rPr>
+                <w:rFonts w:ascii="Arial" w:cs="Arial" w:eastAsia="Arial" w:hAnsi="Arial"/>
+                <w:b/>
+                <w:bCs/>
+                <w:color w:val="FFFFFF"/>
+                <w:sz w:val="20"/>
+                <w:szCs w:val="20"/>
+              </w:rPr>
+              <w:t xml:space="preserve">Respaldar datos ahora</w:t>
+            </w:r>
+          </w:p>
+        </w:tc>
+      </w:tr>
+      <w:tr>
+        <w:trPr>
+          <w:cantSplit/>
+        </w:trPr>
+        <w:tc>
+          <w:tcPr>
+            <w:tcW w:type="dxa" w:w="2300"/>
+            <w:tcBorders>
+              <w:top w:val="single" w:color="C9D6CC" w:sz="4"/>
+              <w:left w:val="single" w:color="C9D6CC" w:sz="4"/>
+              <w:bottom w:val="single" w:color="C9D6CC" w:sz="4"/>
+              <w:right w:val="single" w:color="C9D6CC" w:sz="4"/>
+            </w:tcBorders>
+            <w:tcMar>
+              <w:top w:type="dxa" w:w="70"/>
+              <w:left w:type="dxa" w:w="110"/>
+              <w:bottom w:type="dxa" w:w="70"/>
+              <w:right w:type="dxa" w:w="110"/>
+            </w:tcMar>
+          </w:tcPr>
+          <w:p>
+            <w:pPr>
+              <w:spacing w:after="0" w:line="252"/>
+            </w:pPr>
+            <w:r>
+              <w:rPr>
+                <w:rFonts w:ascii="Arial" w:cs="Arial" w:eastAsia="Arial" w:hAnsi="Arial"/>
+                <w:b/>
+                <w:bCs/>
+                <w:sz w:val="20"/>
+                <w:szCs w:val="20"/>
+              </w:rPr>
+              <w:t xml:space="preserve">Qué respalda</w:t>
+            </w:r>
+          </w:p>
+        </w:tc>
+        <w:tc>
+          <w:tcPr>
+            <w:tcW w:type="dxa" w:w="3530"/>
+            <w:tcBorders>
+              <w:top w:val="single" w:color="C9D6CC" w:sz="4"/>
+              <w:left w:val="single" w:color="C9D6CC" w:sz="4"/>
+              <w:bottom w:val="single" w:color="C9D6CC" w:sz="4"/>
+              <w:right w:val="single" w:color="C9D6CC" w:sz="4"/>
+            </w:tcBorders>
+            <w:tcMar>
+              <w:top w:type="dxa" w:w="70"/>
+              <w:left w:type="dxa" w:w="110"/>
+              <w:bottom w:type="dxa" w:w="70"/>
+              <w:right w:type="dxa" w:w="110"/>
+            </w:tcMar>
+          </w:tcPr>
+          <w:p>
+            <w:pPr>
+              <w:spacing w:after="0" w:line="252"/>
+            </w:pPr>
+            <w:r>
+              <w:rPr>
+                <w:rFonts w:ascii="Arial" w:cs="Arial" w:eastAsia="Arial" w:hAnsi="Arial"/>
+                <w:sz w:val="20"/>
+                <w:szCs w:val="20"/>
+              </w:rPr>
+              <w:t xml:space="preserve">Los </w:t>
+            </w:r>
+            <w:r>
+              <w:rPr>
+                <w:rFonts w:ascii="Arial" w:cs="Arial" w:eastAsia="Arial" w:hAnsi="Arial"/>
+                <w:b/>
+                <w:bCs/>
+                <w:sz w:val="20"/>
+                <w:szCs w:val="20"/>
+              </w:rPr>
+              <w:t xml:space="preserve">archivos</w:t>
+            </w:r>
+            <w:r>
+              <w:rPr>
+                <w:rFonts w:ascii="Arial" w:cs="Arial" w:eastAsia="Arial" w:hAnsi="Arial"/>
+                <w:sz w:val="20"/>
+                <w:szCs w:val="20"/>
+              </w:rPr>
+              <w:t xml:space="preserve"> de una carpeta: fotos, PDF, documentos.</w:t>
+            </w:r>
+          </w:p>
+        </w:tc>
+        <w:tc>
+          <w:tcPr>
+            <w:tcW w:type="dxa" w:w="3530"/>
+            <w:tcBorders>
+              <w:top w:val="single" w:color="C9D6CC" w:sz="4"/>
+              <w:left w:val="single" w:color="C9D6CC" w:sz="4"/>
+              <w:bottom w:val="single" w:color="C9D6CC" w:sz="4"/>
+              <w:right w:val="single" w:color="C9D6CC" w:sz="4"/>
+            </w:tcBorders>
+            <w:tcMar>
+              <w:top w:type="dxa" w:w="70"/>
+              <w:left w:type="dxa" w:w="110"/>
+              <w:bottom w:type="dxa" w:w="70"/>
+              <w:right w:type="dxa" w:w="110"/>
+            </w:tcMar>
+          </w:tcPr>
+          <w:p>
+            <w:pPr>
+              <w:spacing w:after="0" w:line="252"/>
+            </w:pPr>
+            <w:r>
+              <w:rPr>
+                <w:rFonts w:ascii="Arial" w:cs="Arial" w:eastAsia="Arial" w:hAnsi="Arial"/>
+                <w:sz w:val="20"/>
+                <w:szCs w:val="20"/>
+              </w:rPr>
+              <w:t xml:space="preserve">La </w:t>
+            </w:r>
+            <w:r>
+              <w:rPr>
+                <w:rFonts w:ascii="Arial" w:cs="Arial" w:eastAsia="Arial" w:hAnsi="Arial"/>
+                <w:b/>
+                <w:bCs/>
+                <w:sz w:val="20"/>
+                <w:szCs w:val="20"/>
+              </w:rPr>
+              <w:t xml:space="preserve">información del sistema</w:t>
+            </w:r>
+            <w:r>
+              <w:rPr>
+                <w:rFonts w:ascii="Arial" w:cs="Arial" w:eastAsia="Arial" w:hAnsi="Arial"/>
+                <w:sz w:val="20"/>
+                <w:szCs w:val="20"/>
+              </w:rPr>
+              <w:t xml:space="preserve">: mascotas, vacunas, adopciones, donantes, alertas, clientes, notas, fotos de las mascotas y usuarios.</w:t>
+            </w:r>
+          </w:p>
+        </w:tc>
+      </w:tr>
+      <w:tr>
+        <w:trPr>
+          <w:cantSplit/>
+        </w:trPr>
+        <w:tc>
+          <w:tcPr>
+            <w:tcW w:type="dxa" w:w="2300"/>
+            <w:tcBorders>
+              <w:top w:val="single" w:color="C9D6CC" w:sz="4"/>
+              <w:left w:val="single" w:color="C9D6CC" w:sz="4"/>
+              <w:bottom w:val="single" w:color="C9D6CC" w:sz="4"/>
+              <w:right w:val="single" w:color="C9D6CC" w:sz="4"/>
+            </w:tcBorders>
+            <w:tcMar>
+              <w:top w:type="dxa" w:w="70"/>
+              <w:left w:type="dxa" w:w="110"/>
+              <w:bottom w:type="dxa" w:w="70"/>
+              <w:right w:type="dxa" w:w="110"/>
+            </w:tcMar>
+          </w:tcPr>
+          <w:p>
+            <w:pPr>
+              <w:spacing w:after="0" w:line="252"/>
+            </w:pPr>
+            <w:r>
+              <w:rPr>
+                <w:rFonts w:ascii="Arial" w:cs="Arial" w:eastAsia="Arial" w:hAnsi="Arial"/>
+                <w:b/>
+                <w:bCs/>
+                <w:sz w:val="20"/>
+                <w:szCs w:val="20"/>
+              </w:rPr>
+              <w:t xml:space="preserve">Dónde queda</w:t>
+            </w:r>
+          </w:p>
+        </w:tc>
+        <w:tc>
+          <w:tcPr>
+            <w:tcW w:type="dxa" w:w="3530"/>
+            <w:tcBorders>
+              <w:top w:val="single" w:color="C9D6CC" w:sz="4"/>
+              <w:left w:val="single" w:color="C9D6CC" w:sz="4"/>
+              <w:bottom w:val="single" w:color="C9D6CC" w:sz="4"/>
+              <w:right w:val="single" w:color="C9D6CC" w:sz="4"/>
+            </w:tcBorders>
+            <w:tcMar>
+              <w:top w:type="dxa" w:w="70"/>
+              <w:left w:type="dxa" w:w="110"/>
+              <w:bottom w:type="dxa" w:w="70"/>
+              <w:right w:type="dxa" w:w="110"/>
+            </w:tcMar>
+          </w:tcPr>
+          <w:p>
+            <w:pPr>
+              <w:spacing w:after="0" w:line="252"/>
+            </w:pPr>
+            <w:r>
+              <w:rPr>
+                <w:rFonts w:ascii="Arial" w:cs="Arial" w:eastAsia="Arial" w:hAnsi="Arial"/>
+                <w:sz w:val="20"/>
+                <w:szCs w:val="20"/>
+              </w:rPr>
+              <w:t xml:space="preserve">Solo en la computadora, dentro de Backups.</w:t>
+            </w:r>
+          </w:p>
+        </w:tc>
+        <w:tc>
+          <w:tcPr>
+            <w:tcW w:type="dxa" w:w="3530"/>
+            <w:tcBorders>
+              <w:top w:val="single" w:color="C9D6CC" w:sz="4"/>
+              <w:left w:val="single" w:color="C9D6CC" w:sz="4"/>
+              <w:bottom w:val="single" w:color="C9D6CC" w:sz="4"/>
+              <w:right w:val="single" w:color="C9D6CC" w:sz="4"/>
+            </w:tcBorders>
+            <w:tcMar>
+              <w:top w:type="dxa" w:w="70"/>
+              <w:left w:type="dxa" w:w="110"/>
+              <w:bottom w:type="dxa" w:w="70"/>
+              <w:right w:type="dxa" w:w="110"/>
+            </w:tcMar>
+          </w:tcPr>
+          <w:p>
+            <w:pPr>
+              <w:spacing w:after="0" w:line="252"/>
+            </w:pPr>
+            <w:r>
+              <w:rPr>
+                <w:rFonts w:ascii="Arial" w:cs="Arial" w:eastAsia="Arial" w:hAnsi="Arial"/>
+                <w:sz w:val="20"/>
+                <w:szCs w:val="20"/>
+              </w:rPr>
+              <w:t xml:space="preserve">En la computadora (archivos CSV) y una copia en la base de datos en internet.</w:t>
+            </w:r>
+          </w:p>
+        </w:tc>
+      </w:tr>
+      <w:tr>
+        <w:trPr>
+          <w:cantSplit/>
+        </w:trPr>
+        <w:tc>
+          <w:tcPr>
+            <w:tcW w:type="dxa" w:w="2300"/>
+            <w:tcBorders>
+              <w:top w:val="single" w:color="C9D6CC" w:sz="4"/>
+              <w:left w:val="single" w:color="C9D6CC" w:sz="4"/>
+              <w:bottom w:val="single" w:color="C9D6CC" w:sz="4"/>
+              <w:right w:val="single" w:color="C9D6CC" w:sz="4"/>
+            </w:tcBorders>
+            <w:tcMar>
+              <w:top w:type="dxa" w:w="70"/>
+              <w:left w:type="dxa" w:w="110"/>
+              <w:bottom w:type="dxa" w:w="70"/>
+              <w:right w:type="dxa" w:w="110"/>
+            </w:tcMar>
+          </w:tcPr>
+          <w:p>
+            <w:pPr>
+              <w:spacing w:after="0" w:line="252"/>
+            </w:pPr>
+            <w:r>
+              <w:rPr>
+                <w:rFonts w:ascii="Arial" w:cs="Arial" w:eastAsia="Arial" w:hAnsi="Arial"/>
+                <w:b/>
+                <w:bCs/>
+                <w:sz w:val="20"/>
+                <w:szCs w:val="20"/>
+              </w:rPr>
+              <w:t xml:space="preserve">Cuándo usarlo</w:t>
+            </w:r>
+          </w:p>
+        </w:tc>
+        <w:tc>
+          <w:tcPr>
+            <w:tcW w:type="dxa" w:w="3530"/>
+            <w:tcBorders>
+              <w:top w:val="single" w:color="C9D6CC" w:sz="4"/>
+              <w:left w:val="single" w:color="C9D6CC" w:sz="4"/>
+              <w:bottom w:val="single" w:color="C9D6CC" w:sz="4"/>
+              <w:right w:val="single" w:color="C9D6CC" w:sz="4"/>
+            </w:tcBorders>
+            <w:tcMar>
+              <w:top w:type="dxa" w:w="70"/>
+              <w:left w:type="dxa" w:w="110"/>
+              <w:bottom w:type="dxa" w:w="70"/>
+              <w:right w:type="dxa" w:w="110"/>
+            </w:tcMar>
+          </w:tcPr>
+          <w:p>
+            <w:pPr>
+              <w:spacing w:after="0" w:line="252"/>
+            </w:pPr>
+            <w:r>
+              <w:rPr>
+                <w:rFonts w:ascii="Arial" w:cs="Arial" w:eastAsia="Arial" w:hAnsi="Arial"/>
+                <w:sz w:val="20"/>
+                <w:szCs w:val="20"/>
+              </w:rPr>
+              <w:t xml:space="preserve">Para guardar copia de lo que subiste como archivos.</w:t>
+            </w:r>
+          </w:p>
+        </w:tc>
+        <w:tc>
+          <w:tcPr>
+            <w:tcW w:type="dxa" w:w="3530"/>
+            <w:tcBorders>
+              <w:top w:val="single" w:color="C9D6CC" w:sz="4"/>
+              <w:left w:val="single" w:color="C9D6CC" w:sz="4"/>
+              <w:bottom w:val="single" w:color="C9D6CC" w:sz="4"/>
+              <w:right w:val="single" w:color="C9D6CC" w:sz="4"/>
+            </w:tcBorders>
+            <w:tcMar>
+              <w:top w:type="dxa" w:w="70"/>
+              <w:left w:type="dxa" w:w="110"/>
+              <w:bottom w:type="dxa" w:w="70"/>
+              <w:right w:type="dxa" w:w="110"/>
+            </w:tcMar>
+          </w:tcPr>
+          <w:p>
+            <w:pPr>
+              <w:spacing w:after="0" w:line="252"/>
+            </w:pPr>
+            <w:r>
+              <w:rPr>
+                <w:rFonts w:ascii="Arial" w:cs="Arial" w:eastAsia="Arial" w:hAnsi="Arial"/>
+                <w:sz w:val="20"/>
+                <w:szCs w:val="20"/>
+              </w:rPr>
+              <w:t xml:space="preserve">Para guardar copia de lo que está registrado en PawOS.</w:t>
+            </w:r>
+          </w:p>
+        </w:tc>
+      </w:tr>
+    </w:tbl>
+    <w:p>
+      <w:pPr>
+        <w:spacing w:after="100"/>
+      </w:pPr>
+    </w:p>
+    <w:p>
+      <w:pPr>
+        <w:pBdr>
+          <w:left w:val="single" w:color="1D7A3E" w:sz="18" w:space="8"/>
+        </w:pBdr>
+        <w:shd w:fill="E8F5EC" w:val="clear"/>
+        <w:spacing w:after="160" w:before="120" w:line="270"/>
+        <w:ind w:left="200" w:right="100"/>
+      </w:pPr>
+      <w:r>
+        <w:rPr>
+          <w:rFonts w:ascii="Arial" w:cs="Arial" w:eastAsia="Arial" w:hAnsi="Arial"/>
+          <w:b/>
+          <w:bCs/>
+          <w:color w:val="1D7A3E"/>
+        </w:rPr>
+        <w:t xml:space="preserve">Importante: </w:t>
+      </w:r>
+      <w:r>
+        <w:rPr>
+          <w:rFonts w:ascii="Arial" w:cs="Arial" w:eastAsia="Arial" w:hAnsi="Arial"/>
+        </w:rPr>
+        <w:t xml:space="preserve">Guarda también una copia de los respaldos </w:t>
       </w:r>
       <w:r>
         <w:rPr>
@@ -6319,7 +6762,7 @@
         <w:rPr>
           <w:rFonts w:ascii="Arial" w:cs="Arial" w:eastAsia="Arial" w:hAnsi="Arial"/>
         </w:rPr>
-        <w:t xml:space="preserve"> donde corre PawOS.</w:t>
+        <w:t xml:space="preserve"> donde corre PawOS (por ejemplo en una memoria USB o en tu nube personal). Si la computadora falla, un respaldo que está dentro de ella se pierde con ella.</w:t>
       </w:r>
     </w:p>
     <w:p>
@@ -6469,16 +6912,22 @@
       <w:r>
         <w:rPr>
           <w:rFonts w:ascii="Arial" w:cs="Arial" w:eastAsia="Arial" w:hAnsi="Arial"/>
-          <w:b/>
-          <w:bCs/>
-        </w:rPr>
-        <w:t xml:space="preserve">Respaldar datos ahora</w:t>
-      </w:r>
-      <w:r>
-        <w:rPr>
-          <w:rFonts w:ascii="Arial" w:cs="Arial" w:eastAsia="Arial" w:hAnsi="Arial"/>
-        </w:rPr>
-        <w:t xml:space="preserve">, como se explica en la sección 12.</w:t>
+        </w:rPr>
+        <w:t xml:space="preserve">En la categoría de mascotas se pueden </w:t>
+      </w:r>
+      <w:r>
+        <w:rPr>
+          <w:rFonts w:ascii="Arial" w:cs="Arial" w:eastAsia="Arial" w:hAnsi="Arial"/>
+          <w:b/>
+          <w:bCs/>
+        </w:rPr>
+        <w:t xml:space="preserve">exportar las fotos</w:t>
+      </w:r>
+      <w:r>
+        <w:rPr>
+          <w:rFonts w:ascii="Arial" w:cs="Arial" w:eastAsia="Arial" w:hAnsi="Arial"/>
+        </w:rPr>
+        <w:t xml:space="preserve"> de las mascotas como imágenes.</w:t>
       </w:r>
     </w:p>
     <w:p>
@@ -6494,64 +6943,35 @@
         <w:rPr>
           <w:rFonts w:ascii="Arial" w:cs="Arial" w:eastAsia="Arial" w:hAnsi="Arial"/>
         </w:rPr>
-        <w:t xml:space="preserve">En la categoría de mascotas se pueden </w:t>
-      </w:r>
-      <w:r>
-        <w:rPr>
-          <w:rFonts w:ascii="Arial" w:cs="Arial" w:eastAsia="Arial" w:hAnsi="Arial"/>
-          <w:b/>
-          <w:bCs/>
-        </w:rPr>
-        <w:t xml:space="preserve">exportar las fotos</w:t>
-      </w:r>
-      <w:r>
-        <w:rPr>
-          <w:rFonts w:ascii="Arial" w:cs="Arial" w:eastAsia="Arial" w:hAnsi="Arial"/>
-        </w:rPr>
-        <w:t xml:space="preserve"> de las mascotas como imágenes.</w:t>
-      </w:r>
-    </w:p>
-    <w:p>
-      <w:pPr>
-        <w:pStyle w:val="Heading1"/>
-        <w:keepNext/>
-        <w:spacing w:after="160" w:before="360"/>
-      </w:pPr>
-      <w:r>
-        <w:rPr>
-          <w:rFonts w:ascii="Arial" w:cs="Arial" w:eastAsia="Arial" w:hAnsi="Arial"/>
-          <w:b/>
-          <w:bCs/>
-          <w:color w:val="1D7A3E"/>
-          <w:sz w:val="32"/>
-          <w:szCs w:val="32"/>
-        </w:rPr>
-        <w:t xml:space="preserve">14. Portal de Clientes</w:t>
-      </w:r>
-    </w:p>
-    <w:p>
-      <w:pPr>
-        <w:spacing w:after="120" w:line="276"/>
-      </w:pPr>
-      <w:r>
-        <w:rPr>
-          <w:rFonts w:ascii="Arial" w:cs="Arial" w:eastAsia="Arial" w:hAnsi="Arial"/>
-        </w:rPr>
-        <w:t xml:space="preserve">Es el programa para las personas que quieren adoptar o donar. Tiene su propio ícono, </w:t>
-      </w:r>
-      <w:r>
-        <w:rPr>
-          <w:rFonts w:ascii="Arial" w:cs="Arial" w:eastAsia="Arial" w:hAnsi="Arial"/>
-          <w:b/>
-          <w:bCs/>
-        </w:rPr>
-        <w:t xml:space="preserve">PawOS - Portal de Clientes</w:t>
-      </w:r>
-      <w:r>
-        <w:rPr>
-          <w:rFonts w:ascii="Arial" w:cs="Arial" w:eastAsia="Arial" w:hAnsi="Arial"/>
-        </w:rPr>
-        <w:t xml:space="preserve">.</w:t>
+        <w:t xml:space="preserve">Dos botones de respaldo: </w:t>
+      </w:r>
+      <w:r>
+        <w:rPr>
+          <w:rFonts w:ascii="Arial" w:cs="Arial" w:eastAsia="Arial" w:hAnsi="Arial"/>
+          <w:b/>
+          <w:bCs/>
+        </w:rPr>
+        <w:t xml:space="preserve">Respaldar carpeta</w:t>
+      </w:r>
+      <w:r>
+        <w:rPr>
+          <w:rFonts w:ascii="Arial" w:cs="Arial" w:eastAsia="Arial" w:hAnsi="Arial"/>
+        </w:rPr>
+        <w:t xml:space="preserve"> y </w:t>
+      </w:r>
+      <w:r>
+        <w:rPr>
+          <w:rFonts w:ascii="Arial" w:cs="Arial" w:eastAsia="Arial" w:hAnsi="Arial"/>
+          <w:b/>
+          <w:bCs/>
+        </w:rPr>
+        <w:t xml:space="preserve">Respaldar datos ahora</w:t>
+      </w:r>
+      <w:r>
+        <w:rPr>
+          <w:rFonts w:ascii="Arial" w:cs="Arial" w:eastAsia="Arial" w:hAnsi="Arial"/>
+        </w:rPr>
+        <w:t xml:space="preserve">, que se explican a continuación.</w:t>
       </w:r>
     </w:p>
     <w:p>
@@ -6569,7 +6989,158 @@
           <w:sz w:val="26"/>
           <w:szCs w:val="26"/>
         </w:rPr>
-        <w:t xml:space="preserve">Crear una cuenta</w:t>
+        <w:t xml:space="preserve">Respaldar carpeta: copiar archivos</w:t>
+      </w:r>
+    </w:p>
+    <w:p>
+      <w:pPr>
+        <w:spacing w:after="120" w:line="276"/>
+      </w:pPr>
+      <w:r>
+        <w:rPr>
+          <w:rFonts w:ascii="Arial" w:cs="Arial" w:eastAsia="Arial" w:hAnsi="Arial"/>
+        </w:rPr>
+        <w:t xml:space="preserve">Hace una copia de una carpeta con todo lo que tiene adentro (fotos, documentos y subcarpetas). </w:t>
+      </w:r>
+      <w:r>
+        <w:rPr>
+          <w:rFonts w:ascii="Arial" w:cs="Arial" w:eastAsia="Arial" w:hAnsi="Arial"/>
+          <w:b/>
+          <w:bCs/>
+        </w:rPr>
+        <w:t xml:space="preserve">No toca la base de datos ni sube nada a internet.</w:t>
+      </w:r>
+    </w:p>
+    <w:p>
+      <w:pPr>
+        <w:spacing w:after="120" w:line="276"/>
+      </w:pPr>
+      <w:r>
+        <w:rPr>
+          <w:rFonts w:ascii="Arial" w:cs="Arial" w:eastAsia="Arial" w:hAnsi="Arial"/>
+          <w:b/>
+          <w:bCs/>
+        </w:rPr>
+        <w:t xml:space="preserve">¿Qué carpeta copia?</w:t>
+      </w:r>
+    </w:p>
+    <w:p>
+      <w:pPr>
+        <w:pStyle w:val="ListParagraph"/>
+        <w:numPr>
+          <w:ilvl w:val="0"/>
+          <w:numId w:val="3"/>
+        </w:numPr>
+        <w:spacing w:after="80" w:line="270"/>
+      </w:pPr>
+      <w:r>
+        <w:rPr>
+          <w:rFonts w:ascii="Arial" w:cs="Arial" w:eastAsia="Arial" w:hAnsi="Arial"/>
+        </w:rPr>
+        <w:t xml:space="preserve">Si </w:t>
+      </w:r>
+      <w:r>
+        <w:rPr>
+          <w:rFonts w:ascii="Arial" w:cs="Arial" w:eastAsia="Arial" w:hAnsi="Arial"/>
+          <w:b/>
+          <w:bCs/>
+        </w:rPr>
+        <w:t xml:space="preserve">no marcaste nada</w:t>
+      </w:r>
+      <w:r>
+        <w:rPr>
+          <w:rFonts w:ascii="Arial" w:cs="Arial" w:eastAsia="Arial" w:hAnsi="Arial"/>
+        </w:rPr>
+        <w:t xml:space="preserve"> en la lista, copia la carpeta que tienes abierta.</w:t>
+      </w:r>
+    </w:p>
+    <w:p>
+      <w:pPr>
+        <w:pStyle w:val="ListParagraph"/>
+        <w:numPr>
+          <w:ilvl w:val="0"/>
+          <w:numId w:val="3"/>
+        </w:numPr>
+        <w:spacing w:after="80" w:line="270"/>
+      </w:pPr>
+      <w:r>
+        <w:rPr>
+          <w:rFonts w:ascii="Arial" w:cs="Arial" w:eastAsia="Arial" w:hAnsi="Arial"/>
+        </w:rPr>
+        <w:t xml:space="preserve">Si marcaste </w:t>
+      </w:r>
+      <w:r>
+        <w:rPr>
+          <w:rFonts w:ascii="Arial" w:cs="Arial" w:eastAsia="Arial" w:hAnsi="Arial"/>
+          <w:b/>
+          <w:bCs/>
+        </w:rPr>
+        <w:t xml:space="preserve">una sola carpeta</w:t>
+      </w:r>
+      <w:r>
+        <w:rPr>
+          <w:rFonts w:ascii="Arial" w:cs="Arial" w:eastAsia="Arial" w:hAnsi="Arial"/>
+        </w:rPr>
+        <w:t xml:space="preserve">, copia esa.</w:t>
+      </w:r>
+    </w:p>
+    <w:p>
+      <w:pPr>
+        <w:pStyle w:val="ListParagraph"/>
+        <w:numPr>
+          <w:ilvl w:val="0"/>
+          <w:numId w:val="3"/>
+        </w:numPr>
+        <w:spacing w:after="80" w:line="270"/>
+      </w:pPr>
+      <w:r>
+        <w:rPr>
+          <w:rFonts w:ascii="Arial" w:cs="Arial" w:eastAsia="Arial" w:hAnsi="Arial"/>
+        </w:rPr>
+        <w:t xml:space="preserve">Si marcaste archivos sueltos o varias cosas, el programa te pide marcar una sola carpeta (o quitar la selección con un clic en un espacio vacío).</w:t>
+      </w:r>
+    </w:p>
+    <w:p>
+      <w:pPr>
+        <w:pStyle w:val="ListParagraph"/>
+        <w:numPr>
+          <w:ilvl w:val="0"/>
+          <w:numId w:val="3"/>
+        </w:numPr>
+        <w:spacing w:after="80" w:line="270"/>
+      </w:pPr>
+      <w:r>
+        <w:rPr>
+          <w:rFonts w:ascii="Arial" w:cs="Arial" w:eastAsia="Arial" w:hAnsi="Arial"/>
+        </w:rPr>
+        <w:t xml:space="preserve">En la categoría </w:t>
+      </w:r>
+      <w:r>
+        <w:rPr>
+          <w:rFonts w:ascii="Arial" w:cs="Arial" w:eastAsia="Arial" w:hAnsi="Arial"/>
+          <w:b/>
+          <w:bCs/>
+        </w:rPr>
+        <w:t xml:space="preserve">Backups</w:t>
+      </w:r>
+      <w:r>
+        <w:rPr>
+          <w:rFonts w:ascii="Arial" w:cs="Arial" w:eastAsia="Arial" w:hAnsi="Arial"/>
+        </w:rPr>
+        <w:t xml:space="preserve"> no funciona, porque ahí ya se guardan los respaldos. Elige otra categoría.</w:t>
+      </w:r>
+    </w:p>
+    <w:p>
+      <w:pPr>
+        <w:spacing w:after="120" w:line="276"/>
+      </w:pPr>
+      <w:r>
+        <w:rPr>
+          <w:rFonts w:ascii="Arial" w:cs="Arial" w:eastAsia="Arial" w:hAnsi="Arial"/>
+          <w:b/>
+          <w:bCs/>
+        </w:rPr>
+        <w:t xml:space="preserve">Paso a paso:</w:t>
       </w:r>
     </w:p>
     <w:p>
@@ -6585,7 +7156,21 @@
         <w:rPr>
           <w:rFonts w:ascii="Arial" w:cs="Arial" w:eastAsia="Arial" w:hAnsi="Arial"/>
         </w:rPr>
-        <w:t xml:space="preserve">En la pantalla de inicio, elige registrarte como cliente.</w:t>
+        <w:t xml:space="preserve">En la lista de la izquierda, elige la categoría (por ejemplo </w:t>
+      </w:r>
+      <w:r>
+        <w:rPr>
+          <w:rFonts w:ascii="Arial" w:cs="Arial" w:eastAsia="Arial" w:hAnsi="Arial"/>
+          <w:b/>
+          <w:bCs/>
+        </w:rPr>
+        <w:t xml:space="preserve">Mascotas</w:t>
+      </w:r>
+      <w:r>
+        <w:rPr>
+          <w:rFonts w:ascii="Arial" w:cs="Arial" w:eastAsia="Arial" w:hAnsi="Arial"/>
+        </w:rPr>
+        <w:t xml:space="preserve">).</w:t>
       </w:r>
     </w:p>
     <w:p>
@@ -6601,7 +7186,7 @@
         <w:rPr>
           <w:rFonts w:ascii="Arial" w:cs="Arial" w:eastAsia="Arial" w:hAnsi="Arial"/>
         </w:rPr>
-        <w:t xml:space="preserve">Escribe tu nombre, correo, teléfono y una contraseña (puedes verla con el ícono del ojito).</w:t>
+        <w:t xml:space="preserve">Si quieres copiar una carpeta en particular, márcala. Si no, se copia la carpeta abierta.</w:t>
       </w:r>
     </w:p>
     <w:p>
@@ -6617,7 +7202,21 @@
         <w:rPr>
           <w:rFonts w:ascii="Arial" w:cs="Arial" w:eastAsia="Arial" w:hAnsi="Arial"/>
         </w:rPr>
-        <w:t xml:space="preserve">Agrega una foto si quieres. Puedes recortarla, girarla, voltearla y ajustar brillo y contraste.</w:t>
+        <w:t xml:space="preserve">Pulsa </w:t>
+      </w:r>
+      <w:r>
+        <w:rPr>
+          <w:rFonts w:ascii="Arial" w:cs="Arial" w:eastAsia="Arial" w:hAnsi="Arial"/>
+          <w:b/>
+          <w:bCs/>
+        </w:rPr>
+        <w:t xml:space="preserve">Respaldar carpeta</w:t>
+      </w:r>
+      <w:r>
+        <w:rPr>
+          <w:rFonts w:ascii="Arial" w:cs="Arial" w:eastAsia="Arial" w:hAnsi="Arial"/>
+        </w:rPr>
+        <w:t xml:space="preserve">.</w:t>
       </w:r>
     </w:p>
     <w:p>
@@ -6626,6 +7225,1001 @@
         <w:numPr>
           <w:ilvl w:val="0"/>
           <w:numId w:val="6"/>
+        </w:numPr>
+        <w:spacing w:after="80" w:line="270"/>
+      </w:pPr>
+      <w:r>
+        <w:rPr>
+          <w:rFonts w:ascii="Arial" w:cs="Arial" w:eastAsia="Arial" w:hAnsi="Arial"/>
+        </w:rPr>
+        <w:t xml:space="preserve">Escribe un nombre para el respaldo, o deja el que sugiere (lleva la fecha y la hora). No puede repetirse un nombre que ya exista en Backups.</w:t>
+      </w:r>
+    </w:p>
+    <w:p>
+      <w:pPr>
+        <w:pStyle w:val="ListParagraph"/>
+        <w:numPr>
+          <w:ilvl w:val="0"/>
+          <w:numId w:val="6"/>
+        </w:numPr>
+        <w:spacing w:after="80" w:line="270"/>
+      </w:pPr>
+      <w:r>
+        <w:rPr>
+          <w:rFonts w:ascii="Arial" w:cs="Arial" w:eastAsia="Arial" w:hAnsi="Arial"/>
+        </w:rPr>
+        <w:t xml:space="preserve">Pulsa </w:t>
+      </w:r>
+      <w:r>
+        <w:rPr>
+          <w:rFonts w:ascii="Arial" w:cs="Arial" w:eastAsia="Arial" w:hAnsi="Arial"/>
+          <w:b/>
+          <w:bCs/>
+        </w:rPr>
+        <w:t xml:space="preserve">Respaldar</w:t>
+      </w:r>
+      <w:r>
+        <w:rPr>
+          <w:rFonts w:ascii="Arial" w:cs="Arial" w:eastAsia="Arial" w:hAnsi="Arial"/>
+        </w:rPr>
+        <w:t xml:space="preserve">. Al terminar, un mensaje te dice cuántos archivos se copiaron, su tamaño y si hubo errores.</w:t>
+      </w:r>
+    </w:p>
+    <w:p>
+      <w:pPr>
+        <w:spacing w:after="120" w:line="276"/>
+      </w:pPr>
+      <w:r>
+        <w:rPr>
+          <w:rFonts w:ascii="Arial" w:cs="Arial" w:eastAsia="Arial" w:hAnsi="Arial"/>
+        </w:rPr>
+        <w:t xml:space="preserve">La copia queda en la categoría </w:t>
+      </w:r>
+      <w:r>
+        <w:rPr>
+          <w:rFonts w:ascii="Arial" w:cs="Arial" w:eastAsia="Arial" w:hAnsi="Arial"/>
+          <w:b/>
+          <w:bCs/>
+        </w:rPr>
+        <w:t xml:space="preserve">Backups</w:t>
+      </w:r>
+      <w:r>
+        <w:rPr>
+          <w:rFonts w:ascii="Arial" w:cs="Arial" w:eastAsia="Arial" w:hAnsi="Arial"/>
+        </w:rPr>
+        <w:t xml:space="preserve">, dentro de una carpeta con el nombre que elegiste.</w:t>
+      </w:r>
+    </w:p>
+    <w:p>
+      <w:pPr>
+        <w:pStyle w:val="Heading2"/>
+        <w:keepNext/>
+        <w:spacing w:after="100" w:before="240"/>
+      </w:pPr>
+      <w:r>
+        <w:rPr>
+          <w:rFonts w:ascii="Arial" w:cs="Arial" w:eastAsia="Arial" w:hAnsi="Arial"/>
+          <w:b/>
+          <w:bCs/>
+          <w:color w:val="2B2B2B"/>
+          <w:sz w:val="26"/>
+          <w:szCs w:val="26"/>
+        </w:rPr>
+        <w:t xml:space="preserve">Respaldar datos ahora: copiar la información del sistema</w:t>
+      </w:r>
+    </w:p>
+    <w:p>
+      <w:pPr>
+        <w:spacing w:after="120" w:line="276"/>
+      </w:pPr>
+      <w:r>
+        <w:rPr>
+          <w:rFonts w:ascii="Arial" w:cs="Arial" w:eastAsia="Arial" w:hAnsi="Arial"/>
+        </w:rPr>
+        <w:t xml:space="preserve">Guarda una copia de </w:t>
+      </w:r>
+      <w:r>
+        <w:rPr>
+          <w:rFonts w:ascii="Arial" w:cs="Arial" w:eastAsia="Arial" w:hAnsi="Arial"/>
+          <w:b/>
+          <w:bCs/>
+        </w:rPr>
+        <w:t xml:space="preserve">lo que está registrado en PawOS</w:t>
+      </w:r>
+      <w:r>
+        <w:rPr>
+          <w:rFonts w:ascii="Arial" w:cs="Arial" w:eastAsia="Arial" w:hAnsi="Arial"/>
+        </w:rPr>
+        <w:t xml:space="preserve">. Al pulsarlo, primero te pregunta </w:t>
+      </w:r>
+      <w:r>
+        <w:rPr>
+          <w:rFonts w:ascii="Arial" w:cs="Arial" w:eastAsia="Arial" w:hAnsi="Arial"/>
+          <w:b/>
+          <w:bCs/>
+        </w:rPr>
+        <w:t xml:space="preserve">qué quieres respaldar</w:t>
+      </w:r>
+      <w:r>
+        <w:rPr>
+          <w:rFonts w:ascii="Arial" w:cs="Arial" w:eastAsia="Arial" w:hAnsi="Arial"/>
+        </w:rPr>
+        <w:t xml:space="preserve">, con casillas. Todo viene marcado, y puedes desmarcar lo que no necesites, incluso dejar una sola opción.</w:t>
+      </w:r>
+    </w:p>
+    <w:tbl>
+      <w:tblPr>
+        <w:tblW w:type="dxa" w:w="9360"/>
+        <w:tblBorders>
+          <w:top w:val="single" w:color="auto" w:sz="4"/>
+          <w:left w:val="single" w:color="auto" w:sz="4"/>
+          <w:bottom w:val="single" w:color="auto" w:sz="4"/>
+          <w:right w:val="single" w:color="auto" w:sz="4"/>
+          <w:insideH w:val="single" w:color="auto" w:sz="4"/>
+          <w:insideV w:val="single" w:color="auto" w:sz="4"/>
+        </w:tblBorders>
+      </w:tblPr>
+      <w:tblGrid>
+        <w:gridCol w:w="3200"/>
+        <w:gridCol w:w="6160"/>
+      </w:tblGrid>
+      <w:tr>
+        <w:trPr>
+          <w:tblHeader/>
+        </w:trPr>
+        <w:tc>
+          <w:tcPr>
+            <w:tcW w:type="dxa" w:w="3200"/>
+            <w:tcBorders>
+              <w:top w:val="single" w:color="C9D6CC" w:sz="4"/>
+              <w:left w:val="single" w:color="C9D6CC" w:sz="4"/>
+              <w:bottom w:val="single" w:color="C9D6CC" w:sz="4"/>
+              <w:right w:val="single" w:color="C9D6CC" w:sz="4"/>
+            </w:tcBorders>
+            <w:shd w:fill="1D7A3E" w:val="clear"/>
+            <w:tcMar>
+              <w:top w:type="dxa" w:w="70"/>
+              <w:left w:type="dxa" w:w="110"/>
+              <w:bottom w:type="dxa" w:w="70"/>
+              <w:right w:type="dxa" w:w="110"/>
+            </w:tcMar>
+          </w:tcPr>
+          <w:p>
+            <w:pPr>
+              <w:spacing w:after="0" w:line="252"/>
+            </w:pPr>
+            <w:r>
+              <w:rPr>
+                <w:rFonts w:ascii="Arial" w:cs="Arial" w:eastAsia="Arial" w:hAnsi="Arial"/>
+                <w:b/>
+                <w:bCs/>
+                <w:color w:val="FFFFFF"/>
+                <w:sz w:val="20"/>
+                <w:szCs w:val="20"/>
+              </w:rPr>
+              <w:t xml:space="preserve">Opción</w:t>
+            </w:r>
+          </w:p>
+        </w:tc>
+        <w:tc>
+          <w:tcPr>
+            <w:tcW w:type="dxa" w:w="6160"/>
+            <w:tcBorders>
+              <w:top w:val="single" w:color="C9D6CC" w:sz="4"/>
+              <w:left w:val="single" w:color="C9D6CC" w:sz="4"/>
+              <w:bottom w:val="single" w:color="C9D6CC" w:sz="4"/>
+              <w:right w:val="single" w:color="C9D6CC" w:sz="4"/>
+            </w:tcBorders>
+            <w:shd w:fill="1D7A3E" w:val="clear"/>
+            <w:tcMar>
+              <w:top w:type="dxa" w:w="70"/>
+              <w:left w:type="dxa" w:w="110"/>
+              <w:bottom w:type="dxa" w:w="70"/>
+              <w:right w:type="dxa" w:w="110"/>
+            </w:tcMar>
+          </w:tcPr>
+          <w:p>
+            <w:pPr>
+              <w:spacing w:after="0" w:line="252"/>
+            </w:pPr>
+            <w:r>
+              <w:rPr>
+                <w:rFonts w:ascii="Arial" w:cs="Arial" w:eastAsia="Arial" w:hAnsi="Arial"/>
+                <w:b/>
+                <w:bCs/>
+                <w:color w:val="FFFFFF"/>
+                <w:sz w:val="20"/>
+                <w:szCs w:val="20"/>
+              </w:rPr>
+              <w:t xml:space="preserve">Qué incluye</w:t>
+            </w:r>
+          </w:p>
+        </w:tc>
+      </w:tr>
+      <w:tr>
+        <w:trPr>
+          <w:cantSplit/>
+        </w:trPr>
+        <w:tc>
+          <w:tcPr>
+            <w:tcW w:type="dxa" w:w="3200"/>
+            <w:tcBorders>
+              <w:top w:val="single" w:color="C9D6CC" w:sz="4"/>
+              <w:left w:val="single" w:color="C9D6CC" w:sz="4"/>
+              <w:bottom w:val="single" w:color="C9D6CC" w:sz="4"/>
+              <w:right w:val="single" w:color="C9D6CC" w:sz="4"/>
+            </w:tcBorders>
+            <w:tcMar>
+              <w:top w:type="dxa" w:w="70"/>
+              <w:left w:type="dxa" w:w="110"/>
+              <w:bottom w:type="dxa" w:w="70"/>
+              <w:right w:type="dxa" w:w="110"/>
+            </w:tcMar>
+          </w:tcPr>
+          <w:p>
+            <w:pPr>
+              <w:spacing w:after="0" w:line="252"/>
+            </w:pPr>
+            <w:r>
+              <w:rPr>
+                <w:rFonts w:ascii="Arial" w:cs="Arial" w:eastAsia="Arial" w:hAnsi="Arial"/>
+                <w:sz w:val="20"/>
+                <w:szCs w:val="20"/>
+              </w:rPr>
+              <w:t xml:space="preserve">Mascotas, Vacunas, Adopciones, Donantes</w:t>
+            </w:r>
+          </w:p>
+        </w:tc>
+        <w:tc>
+          <w:tcPr>
+            <w:tcW w:type="dxa" w:w="6160"/>
+            <w:tcBorders>
+              <w:top w:val="single" w:color="C9D6CC" w:sz="4"/>
+              <w:left w:val="single" w:color="C9D6CC" w:sz="4"/>
+              <w:bottom w:val="single" w:color="C9D6CC" w:sz="4"/>
+              <w:right w:val="single" w:color="C9D6CC" w:sz="4"/>
+            </w:tcBorders>
+            <w:tcMar>
+              <w:top w:type="dxa" w:w="70"/>
+              <w:left w:type="dxa" w:w="110"/>
+              <w:bottom w:type="dxa" w:w="70"/>
+              <w:right w:type="dxa" w:w="110"/>
+            </w:tcMar>
+          </w:tcPr>
+          <w:p>
+            <w:pPr>
+              <w:spacing w:after="0" w:line="252"/>
+            </w:pPr>
+            <w:r>
+              <w:rPr>
+                <w:rFonts w:ascii="Arial" w:cs="Arial" w:eastAsia="Arial" w:hAnsi="Arial"/>
+                <w:sz w:val="20"/>
+                <w:szCs w:val="20"/>
+              </w:rPr>
+              <w:t xml:space="preserve">Los registros de cada módulo.</w:t>
+            </w:r>
+          </w:p>
+        </w:tc>
+      </w:tr>
+      <w:tr>
+        <w:trPr>
+          <w:cantSplit/>
+        </w:trPr>
+        <w:tc>
+          <w:tcPr>
+            <w:tcW w:type="dxa" w:w="3200"/>
+            <w:tcBorders>
+              <w:top w:val="single" w:color="C9D6CC" w:sz="4"/>
+              <w:left w:val="single" w:color="C9D6CC" w:sz="4"/>
+              <w:bottom w:val="single" w:color="C9D6CC" w:sz="4"/>
+              <w:right w:val="single" w:color="C9D6CC" w:sz="4"/>
+            </w:tcBorders>
+            <w:tcMar>
+              <w:top w:type="dxa" w:w="70"/>
+              <w:left w:type="dxa" w:w="110"/>
+              <w:bottom w:type="dxa" w:w="70"/>
+              <w:right w:type="dxa" w:w="110"/>
+            </w:tcMar>
+          </w:tcPr>
+          <w:p>
+            <w:pPr>
+              <w:spacing w:after="0" w:line="252"/>
+            </w:pPr>
+            <w:r>
+              <w:rPr>
+                <w:rFonts w:ascii="Arial" w:cs="Arial" w:eastAsia="Arial" w:hAnsi="Arial"/>
+                <w:sz w:val="20"/>
+                <w:szCs w:val="20"/>
+              </w:rPr>
+              <w:t xml:space="preserve">Alertas de sensores</w:t>
+            </w:r>
+          </w:p>
+        </w:tc>
+        <w:tc>
+          <w:tcPr>
+            <w:tcW w:type="dxa" w:w="6160"/>
+            <w:tcBorders>
+              <w:top w:val="single" w:color="C9D6CC" w:sz="4"/>
+              <w:left w:val="single" w:color="C9D6CC" w:sz="4"/>
+              <w:bottom w:val="single" w:color="C9D6CC" w:sz="4"/>
+              <w:right w:val="single" w:color="C9D6CC" w:sz="4"/>
+            </w:tcBorders>
+            <w:tcMar>
+              <w:top w:type="dxa" w:w="70"/>
+              <w:left w:type="dxa" w:w="110"/>
+              <w:bottom w:type="dxa" w:w="70"/>
+              <w:right w:type="dxa" w:w="110"/>
+            </w:tcMar>
+          </w:tcPr>
+          <w:p>
+            <w:pPr>
+              <w:spacing w:after="0" w:line="252"/>
+            </w:pPr>
+            <w:r>
+              <w:rPr>
+                <w:rFonts w:ascii="Arial" w:cs="Arial" w:eastAsia="Arial" w:hAnsi="Arial"/>
+                <w:sz w:val="20"/>
+                <w:szCs w:val="20"/>
+              </w:rPr>
+              <w:t xml:space="preserve">Las alertas del sensor ESP32.</w:t>
+            </w:r>
+          </w:p>
+        </w:tc>
+      </w:tr>
+      <w:tr>
+        <w:trPr>
+          <w:cantSplit/>
+        </w:trPr>
+        <w:tc>
+          <w:tcPr>
+            <w:tcW w:type="dxa" w:w="3200"/>
+            <w:tcBorders>
+              <w:top w:val="single" w:color="C9D6CC" w:sz="4"/>
+              <w:left w:val="single" w:color="C9D6CC" w:sz="4"/>
+              <w:bottom w:val="single" w:color="C9D6CC" w:sz="4"/>
+              <w:right w:val="single" w:color="C9D6CC" w:sz="4"/>
+            </w:tcBorders>
+            <w:tcMar>
+              <w:top w:type="dxa" w:w="70"/>
+              <w:left w:type="dxa" w:w="110"/>
+              <w:bottom w:type="dxa" w:w="70"/>
+              <w:right w:type="dxa" w:w="110"/>
+            </w:tcMar>
+          </w:tcPr>
+          <w:p>
+            <w:pPr>
+              <w:spacing w:after="0" w:line="252"/>
+            </w:pPr>
+            <w:r>
+              <w:rPr>
+                <w:rFonts w:ascii="Arial" w:cs="Arial" w:eastAsia="Arial" w:hAnsi="Arial"/>
+                <w:sz w:val="20"/>
+                <w:szCs w:val="20"/>
+              </w:rPr>
+              <w:t xml:space="preserve">Clientes</w:t>
+            </w:r>
+          </w:p>
+        </w:tc>
+        <w:tc>
+          <w:tcPr>
+            <w:tcW w:type="dxa" w:w="6160"/>
+            <w:tcBorders>
+              <w:top w:val="single" w:color="C9D6CC" w:sz="4"/>
+              <w:left w:val="single" w:color="C9D6CC" w:sz="4"/>
+              <w:bottom w:val="single" w:color="C9D6CC" w:sz="4"/>
+              <w:right w:val="single" w:color="C9D6CC" w:sz="4"/>
+            </w:tcBorders>
+            <w:tcMar>
+              <w:top w:type="dxa" w:w="70"/>
+              <w:left w:type="dxa" w:w="110"/>
+              <w:bottom w:type="dxa" w:w="70"/>
+              <w:right w:type="dxa" w:w="110"/>
+            </w:tcMar>
+          </w:tcPr>
+          <w:p>
+            <w:pPr>
+              <w:spacing w:after="0" w:line="252"/>
+            </w:pPr>
+            <w:r>
+              <w:rPr>
+                <w:rFonts w:ascii="Arial" w:cs="Arial" w:eastAsia="Arial" w:hAnsi="Arial"/>
+                <w:sz w:val="20"/>
+                <w:szCs w:val="20"/>
+              </w:rPr>
+              <w:t xml:space="preserve">Correo, nombre, teléfono y rol. </w:t>
+            </w:r>
+            <w:r>
+              <w:rPr>
+                <w:rFonts w:ascii="Arial" w:cs="Arial" w:eastAsia="Arial" w:hAnsi="Arial"/>
+                <w:b/>
+                <w:bCs/>
+                <w:sz w:val="20"/>
+                <w:szCs w:val="20"/>
+              </w:rPr>
+              <w:t xml:space="preserve">No incluye contraseñas.</w:t>
+            </w:r>
+          </w:p>
+        </w:tc>
+      </w:tr>
+      <w:tr>
+        <w:trPr>
+          <w:cantSplit/>
+        </w:trPr>
+        <w:tc>
+          <w:tcPr>
+            <w:tcW w:type="dxa" w:w="3200"/>
+            <w:tcBorders>
+              <w:top w:val="single" w:color="C9D6CC" w:sz="4"/>
+              <w:left w:val="single" w:color="C9D6CC" w:sz="4"/>
+              <w:bottom w:val="single" w:color="C9D6CC" w:sz="4"/>
+              <w:right w:val="single" w:color="C9D6CC" w:sz="4"/>
+            </w:tcBorders>
+            <w:tcMar>
+              <w:top w:type="dxa" w:w="70"/>
+              <w:left w:type="dxa" w:w="110"/>
+              <w:bottom w:type="dxa" w:w="70"/>
+              <w:right w:type="dxa" w:w="110"/>
+            </w:tcMar>
+          </w:tcPr>
+          <w:p>
+            <w:pPr>
+              <w:spacing w:after="0" w:line="252"/>
+            </w:pPr>
+            <w:r>
+              <w:rPr>
+                <w:rFonts w:ascii="Arial" w:cs="Arial" w:eastAsia="Arial" w:hAnsi="Arial"/>
+                <w:sz w:val="20"/>
+                <w:szCs w:val="20"/>
+              </w:rPr>
+              <w:t xml:space="preserve">Notas del veterinario</w:t>
+            </w:r>
+          </w:p>
+        </w:tc>
+        <w:tc>
+          <w:tcPr>
+            <w:tcW w:type="dxa" w:w="6160"/>
+            <w:tcBorders>
+              <w:top w:val="single" w:color="C9D6CC" w:sz="4"/>
+              <w:left w:val="single" w:color="C9D6CC" w:sz="4"/>
+              <w:bottom w:val="single" w:color="C9D6CC" w:sz="4"/>
+              <w:right w:val="single" w:color="C9D6CC" w:sz="4"/>
+            </w:tcBorders>
+            <w:tcMar>
+              <w:top w:type="dxa" w:w="70"/>
+              <w:left w:type="dxa" w:w="110"/>
+              <w:bottom w:type="dxa" w:w="70"/>
+              <w:right w:type="dxa" w:w="110"/>
+            </w:tcMar>
+          </w:tcPr>
+          <w:p>
+            <w:pPr>
+              <w:spacing w:after="0" w:line="252"/>
+            </w:pPr>
+            <w:r>
+              <w:rPr>
+                <w:rFonts w:ascii="Arial" w:cs="Arial" w:eastAsia="Arial" w:hAnsi="Arial"/>
+                <w:sz w:val="20"/>
+                <w:szCs w:val="20"/>
+              </w:rPr>
+              <w:t xml:space="preserve">Las notas clínicas.</w:t>
+            </w:r>
+          </w:p>
+        </w:tc>
+      </w:tr>
+      <w:tr>
+        <w:trPr>
+          <w:cantSplit/>
+        </w:trPr>
+        <w:tc>
+          <w:tcPr>
+            <w:tcW w:type="dxa" w:w="3200"/>
+            <w:tcBorders>
+              <w:top w:val="single" w:color="C9D6CC" w:sz="4"/>
+              <w:left w:val="single" w:color="C9D6CC" w:sz="4"/>
+              <w:bottom w:val="single" w:color="C9D6CC" w:sz="4"/>
+              <w:right w:val="single" w:color="C9D6CC" w:sz="4"/>
+            </w:tcBorders>
+            <w:tcMar>
+              <w:top w:type="dxa" w:w="70"/>
+              <w:left w:type="dxa" w:w="110"/>
+              <w:bottom w:type="dxa" w:w="70"/>
+              <w:right w:type="dxa" w:w="110"/>
+            </w:tcMar>
+          </w:tcPr>
+          <w:p>
+            <w:pPr>
+              <w:spacing w:after="0" w:line="252"/>
+            </w:pPr>
+            <w:r>
+              <w:rPr>
+                <w:rFonts w:ascii="Arial" w:cs="Arial" w:eastAsia="Arial" w:hAnsi="Arial"/>
+                <w:sz w:val="20"/>
+                <w:szCs w:val="20"/>
+              </w:rPr>
+              <w:t xml:space="preserve">Fotos de las mascotas</w:t>
+            </w:r>
+          </w:p>
+        </w:tc>
+        <w:tc>
+          <w:tcPr>
+            <w:tcW w:type="dxa" w:w="6160"/>
+            <w:tcBorders>
+              <w:top w:val="single" w:color="C9D6CC" w:sz="4"/>
+              <w:left w:val="single" w:color="C9D6CC" w:sz="4"/>
+              <w:bottom w:val="single" w:color="C9D6CC" w:sz="4"/>
+              <w:right w:val="single" w:color="C9D6CC" w:sz="4"/>
+            </w:tcBorders>
+            <w:tcMar>
+              <w:top w:type="dxa" w:w="70"/>
+              <w:left w:type="dxa" w:w="110"/>
+              <w:bottom w:type="dxa" w:w="70"/>
+              <w:right w:type="dxa" w:w="110"/>
+            </w:tcMar>
+          </w:tcPr>
+          <w:p>
+            <w:pPr>
+              <w:spacing w:after="0" w:line="252"/>
+            </w:pPr>
+            <w:r>
+              <w:rPr>
+                <w:rFonts w:ascii="Arial" w:cs="Arial" w:eastAsia="Arial" w:hAnsi="Arial"/>
+                <w:sz w:val="20"/>
+                <w:szCs w:val="20"/>
+              </w:rPr>
+              <w:t xml:space="preserve">Una imagen por cada mascota que tenga foto.</w:t>
+            </w:r>
+          </w:p>
+        </w:tc>
+      </w:tr>
+      <w:tr>
+        <w:trPr>
+          <w:cantSplit/>
+        </w:trPr>
+        <w:tc>
+          <w:tcPr>
+            <w:tcW w:type="dxa" w:w="3200"/>
+            <w:tcBorders>
+              <w:top w:val="single" w:color="C9D6CC" w:sz="4"/>
+              <w:left w:val="single" w:color="C9D6CC" w:sz="4"/>
+              <w:bottom w:val="single" w:color="C9D6CC" w:sz="4"/>
+              <w:right w:val="single" w:color="C9D6CC" w:sz="4"/>
+            </w:tcBorders>
+            <w:tcMar>
+              <w:top w:type="dxa" w:w="70"/>
+              <w:left w:type="dxa" w:w="110"/>
+              <w:bottom w:type="dxa" w:w="70"/>
+              <w:right w:type="dxa" w:w="110"/>
+            </w:tcMar>
+          </w:tcPr>
+          <w:p>
+            <w:pPr>
+              <w:spacing w:after="0" w:line="252"/>
+            </w:pPr>
+            <w:r>
+              <w:rPr>
+                <w:rFonts w:ascii="Arial" w:cs="Arial" w:eastAsia="Arial" w:hAnsi="Arial"/>
+                <w:sz w:val="20"/>
+                <w:szCs w:val="20"/>
+              </w:rPr>
+              <w:t xml:space="preserve">Base local de usuarios</w:t>
+            </w:r>
+          </w:p>
+        </w:tc>
+        <w:tc>
+          <w:tcPr>
+            <w:tcW w:type="dxa" w:w="6160"/>
+            <w:tcBorders>
+              <w:top w:val="single" w:color="C9D6CC" w:sz="4"/>
+              <w:left w:val="single" w:color="C9D6CC" w:sz="4"/>
+              <w:bottom w:val="single" w:color="C9D6CC" w:sz="4"/>
+              <w:right w:val="single" w:color="C9D6CC" w:sz="4"/>
+            </w:tcBorders>
+            <w:tcMar>
+              <w:top w:type="dxa" w:w="70"/>
+              <w:left w:type="dxa" w:w="110"/>
+              <w:bottom w:type="dxa" w:w="70"/>
+              <w:right w:type="dxa" w:w="110"/>
+            </w:tcMar>
+          </w:tcPr>
+          <w:p>
+            <w:pPr>
+              <w:spacing w:after="0" w:line="252"/>
+            </w:pPr>
+            <w:r>
+              <w:rPr>
+                <w:rFonts w:ascii="Arial" w:cs="Arial" w:eastAsia="Arial" w:hAnsi="Arial"/>
+                <w:sz w:val="20"/>
+                <w:szCs w:val="20"/>
+              </w:rPr>
+              <w:t xml:space="preserve">Las cuentas del personal.</w:t>
+            </w:r>
+          </w:p>
+        </w:tc>
+      </w:tr>
+    </w:tbl>
+    <w:p>
+      <w:pPr>
+        <w:spacing w:after="100"/>
+      </w:pPr>
+    </w:p>
+    <w:p>
+      <w:pPr>
+        <w:spacing w:after="120" w:line="276"/>
+      </w:pPr>
+      <w:r>
+        <w:rPr>
+          <w:rFonts w:ascii="Arial" w:cs="Arial" w:eastAsia="Arial" w:hAnsi="Arial"/>
+          <w:b/>
+          <w:bCs/>
+        </w:rPr>
+        <w:t xml:space="preserve">Paso a paso:</w:t>
+      </w:r>
+    </w:p>
+    <w:p>
+      <w:pPr>
+        <w:pStyle w:val="ListParagraph"/>
+        <w:numPr>
+          <w:ilvl w:val="0"/>
+          <w:numId w:val="7"/>
+        </w:numPr>
+        <w:spacing w:after="80" w:line="270"/>
+      </w:pPr>
+      <w:r>
+        <w:rPr>
+          <w:rFonts w:ascii="Arial" w:cs="Arial" w:eastAsia="Arial" w:hAnsi="Arial"/>
+        </w:rPr>
+        <w:t xml:space="preserve">Pulsa </w:t>
+      </w:r>
+      <w:r>
+        <w:rPr>
+          <w:rFonts w:ascii="Arial" w:cs="Arial" w:eastAsia="Arial" w:hAnsi="Arial"/>
+          <w:b/>
+          <w:bCs/>
+        </w:rPr>
+        <w:t xml:space="preserve">Respaldar datos ahora</w:t>
+      </w:r>
+      <w:r>
+        <w:rPr>
+          <w:rFonts w:ascii="Arial" w:cs="Arial" w:eastAsia="Arial" w:hAnsi="Arial"/>
+        </w:rPr>
+        <w:t xml:space="preserve"> (también está en el clic derecho de la lista).</w:t>
+      </w:r>
+    </w:p>
+    <w:p>
+      <w:pPr>
+        <w:pStyle w:val="ListParagraph"/>
+        <w:numPr>
+          <w:ilvl w:val="0"/>
+          <w:numId w:val="7"/>
+        </w:numPr>
+        <w:spacing w:after="80" w:line="270"/>
+      </w:pPr>
+      <w:r>
+        <w:rPr>
+          <w:rFonts w:ascii="Arial" w:cs="Arial" w:eastAsia="Arial" w:hAnsi="Arial"/>
+        </w:rPr>
+        <w:t xml:space="preserve">Marca o desmarca lo que quieres respaldar y pulsá </w:t>
+      </w:r>
+      <w:r>
+        <w:rPr>
+          <w:rFonts w:ascii="Arial" w:cs="Arial" w:eastAsia="Arial" w:hAnsi="Arial"/>
+          <w:b/>
+          <w:bCs/>
+        </w:rPr>
+        <w:t xml:space="preserve">Continuar</w:t>
+      </w:r>
+      <w:r>
+        <w:rPr>
+          <w:rFonts w:ascii="Arial" w:cs="Arial" w:eastAsia="Arial" w:hAnsi="Arial"/>
+        </w:rPr>
+        <w:t xml:space="preserve">.</w:t>
+      </w:r>
+    </w:p>
+    <w:p>
+      <w:pPr>
+        <w:pStyle w:val="ListParagraph"/>
+        <w:numPr>
+          <w:ilvl w:val="0"/>
+          <w:numId w:val="7"/>
+        </w:numPr>
+        <w:spacing w:after="80" w:line="270"/>
+      </w:pPr>
+      <w:r>
+        <w:rPr>
+          <w:rFonts w:ascii="Arial" w:cs="Arial" w:eastAsia="Arial" w:hAnsi="Arial"/>
+        </w:rPr>
+        <w:t xml:space="preserve">Escribe un nombre para el respaldo o deja el sugerido. Si elegís una sola opción, el nombre la incluye (por ejemplo, Respaldo_mascotas_…).</w:t>
+      </w:r>
+    </w:p>
+    <w:p>
+      <w:pPr>
+        <w:pStyle w:val="ListParagraph"/>
+        <w:numPr>
+          <w:ilvl w:val="0"/>
+          <w:numId w:val="7"/>
+        </w:numPr>
+        <w:spacing w:after="80" w:line="270"/>
+      </w:pPr>
+      <w:r>
+        <w:rPr>
+          <w:rFonts w:ascii="Arial" w:cs="Arial" w:eastAsia="Arial" w:hAnsi="Arial"/>
+        </w:rPr>
+        <w:t xml:space="preserve">Si ese nombre ya existe en la base de datos en internet, el programa te deja </w:t>
+      </w:r>
+      <w:r>
+        <w:rPr>
+          <w:rFonts w:ascii="Arial" w:cs="Arial" w:eastAsia="Arial" w:hAnsi="Arial"/>
+          <w:b/>
+          <w:bCs/>
+        </w:rPr>
+        <w:t xml:space="preserve">reemplazar</w:t>
+      </w:r>
+      <w:r>
+        <w:rPr>
+          <w:rFonts w:ascii="Arial" w:cs="Arial" w:eastAsia="Arial" w:hAnsi="Arial"/>
+        </w:rPr>
+        <w:t xml:space="preserve"> el respaldo anterior o </w:t>
+      </w:r>
+      <w:r>
+        <w:rPr>
+          <w:rFonts w:ascii="Arial" w:cs="Arial" w:eastAsia="Arial" w:hAnsi="Arial"/>
+          <w:b/>
+          <w:bCs/>
+        </w:rPr>
+        <w:t xml:space="preserve">elegir otro nombre</w:t>
+      </w:r>
+      <w:r>
+        <w:rPr>
+          <w:rFonts w:ascii="Arial" w:cs="Arial" w:eastAsia="Arial" w:hAnsi="Arial"/>
+        </w:rPr>
+        <w:t xml:space="preserve">, para no duplicar.</w:t>
+      </w:r>
+    </w:p>
+    <w:p>
+      <w:pPr>
+        <w:pStyle w:val="ListParagraph"/>
+        <w:numPr>
+          <w:ilvl w:val="0"/>
+          <w:numId w:val="7"/>
+        </w:numPr>
+        <w:spacing w:after="80" w:line="270"/>
+      </w:pPr>
+      <w:r>
+        <w:rPr>
+          <w:rFonts w:ascii="Arial" w:cs="Arial" w:eastAsia="Arial" w:hAnsi="Arial"/>
+        </w:rPr>
+        <w:t xml:space="preserve">Espera el mensaje final. Resume cuántos archivos CSV se guardaron, cuántas copias se registraron en internet, cuántas fotos se copiaron y si se copió la base de usuarios.</w:t>
+      </w:r>
+    </w:p>
+    <w:p>
+      <w:pPr>
+        <w:spacing w:after="120" w:line="276"/>
+      </w:pPr>
+      <w:r>
+        <w:rPr>
+          <w:rFonts w:ascii="Arial" w:cs="Arial" w:eastAsia="Arial" w:hAnsi="Arial"/>
+        </w:rPr>
+        <w:t xml:space="preserve">Si el programa no puede leer alguna tabla (por ejemplo, sin internet), </w:t>
+      </w:r>
+      <w:r>
+        <w:rPr>
+          <w:rFonts w:ascii="Arial" w:cs="Arial" w:eastAsia="Arial" w:hAnsi="Arial"/>
+          <w:b/>
+          <w:bCs/>
+        </w:rPr>
+        <w:t xml:space="preserve">no guarda nada a medias</w:t>
+      </w:r>
+      <w:r>
+        <w:rPr>
+          <w:rFonts w:ascii="Arial" w:cs="Arial" w:eastAsia="Arial" w:hAnsi="Arial"/>
+        </w:rPr>
+        <w:t xml:space="preserve">: te avisa cuál falló para que intentes de nuevo.</w:t>
+      </w:r>
+    </w:p>
+    <w:p>
+      <w:pPr>
+        <w:pBdr>
+          <w:left w:val="single" w:color="1D7A3E" w:sz="18" w:space="8"/>
+        </w:pBdr>
+        <w:shd w:fill="E8F5EC" w:val="clear"/>
+        <w:spacing w:after="160" w:before="120" w:line="270"/>
+        <w:ind w:left="200" w:right="100"/>
+      </w:pPr>
+      <w:r>
+        <w:rPr>
+          <w:rFonts w:ascii="Arial" w:cs="Arial" w:eastAsia="Arial" w:hAnsi="Arial"/>
+          <w:b/>
+          <w:bCs/>
+          <w:color w:val="1D7A3E"/>
+        </w:rPr>
+        <w:t xml:space="preserve">Para recordar: </w:t>
+      </w:r>
+      <w:r>
+        <w:rPr>
+          <w:rFonts w:ascii="Arial" w:cs="Arial" w:eastAsia="Arial" w:hAnsi="Arial"/>
+          <w:b/>
+          <w:bCs/>
+        </w:rPr>
+        <w:t xml:space="preserve">Respaldar carpeta</w:t>
+      </w:r>
+      <w:r>
+        <w:rPr>
+          <w:rFonts w:ascii="Arial" w:cs="Arial" w:eastAsia="Arial" w:hAnsi="Arial"/>
+        </w:rPr>
+        <w:t xml:space="preserve"> guarda </w:t>
+      </w:r>
+      <w:r>
+        <w:rPr>
+          <w:rFonts w:ascii="Arial" w:cs="Arial" w:eastAsia="Arial" w:hAnsi="Arial"/>
+          <w:b/>
+          <w:bCs/>
+        </w:rPr>
+        <w:t xml:space="preserve">archivos</w:t>
+      </w:r>
+      <w:r>
+        <w:rPr>
+          <w:rFonts w:ascii="Arial" w:cs="Arial" w:eastAsia="Arial" w:hAnsi="Arial"/>
+        </w:rPr>
+        <w:t xml:space="preserve"> de la computadora. </w:t>
+      </w:r>
+      <w:r>
+        <w:rPr>
+          <w:rFonts w:ascii="Arial" w:cs="Arial" w:eastAsia="Arial" w:hAnsi="Arial"/>
+          <w:b/>
+          <w:bCs/>
+        </w:rPr>
+        <w:t xml:space="preserve">Respaldar datos ahora</w:t>
+      </w:r>
+      <w:r>
+        <w:rPr>
+          <w:rFonts w:ascii="Arial" w:cs="Arial" w:eastAsia="Arial" w:hAnsi="Arial"/>
+        </w:rPr>
+        <w:t xml:space="preserve"> guarda los </w:t>
+      </w:r>
+      <w:r>
+        <w:rPr>
+          <w:rFonts w:ascii="Arial" w:cs="Arial" w:eastAsia="Arial" w:hAnsi="Arial"/>
+          <w:b/>
+          <w:bCs/>
+        </w:rPr>
+        <w:t xml:space="preserve">datos</w:t>
+      </w:r>
+      <w:r>
+        <w:rPr>
+          <w:rFonts w:ascii="Arial" w:cs="Arial" w:eastAsia="Arial" w:hAnsi="Arial"/>
+        </w:rPr>
+        <w:t xml:space="preserve"> del sistema. Si no estás seguro de cuál usar, usa </w:t>
+      </w:r>
+      <w:r>
+        <w:rPr>
+          <w:rFonts w:ascii="Arial" w:cs="Arial" w:eastAsia="Arial" w:hAnsi="Arial"/>
+          <w:b/>
+          <w:bCs/>
+        </w:rPr>
+        <w:t xml:space="preserve">Respaldar datos ahora</w:t>
+      </w:r>
+      <w:r>
+        <w:rPr>
+          <w:rFonts w:ascii="Arial" w:cs="Arial" w:eastAsia="Arial" w:hAnsi="Arial"/>
+        </w:rPr>
+        <w:t xml:space="preserve">.</w:t>
+      </w:r>
+    </w:p>
+    <w:p>
+      <w:pPr>
+        <w:pStyle w:val="Heading1"/>
+        <w:keepNext/>
+        <w:spacing w:after="160" w:before="360"/>
+      </w:pPr>
+      <w:r>
+        <w:rPr>
+          <w:rFonts w:ascii="Arial" w:cs="Arial" w:eastAsia="Arial" w:hAnsi="Arial"/>
+          <w:b/>
+          <w:bCs/>
+          <w:color w:val="1D7A3E"/>
+          <w:sz w:val="32"/>
+          <w:szCs w:val="32"/>
+        </w:rPr>
+        <w:t xml:space="preserve">14. Portal de Clientes</w:t>
+      </w:r>
+    </w:p>
+    <w:p>
+      <w:pPr>
+        <w:spacing w:after="120" w:line="276"/>
+      </w:pPr>
+      <w:r>
+        <w:rPr>
+          <w:rFonts w:ascii="Arial" w:cs="Arial" w:eastAsia="Arial" w:hAnsi="Arial"/>
+        </w:rPr>
+        <w:t xml:space="preserve">Es el programa para las personas que quieren adoptar o donar. Tiene su propio ícono, </w:t>
+      </w:r>
+      <w:r>
+        <w:rPr>
+          <w:rFonts w:ascii="Arial" w:cs="Arial" w:eastAsia="Arial" w:hAnsi="Arial"/>
+          <w:b/>
+          <w:bCs/>
+        </w:rPr>
+        <w:t xml:space="preserve">PawOS - Portal de Clientes</w:t>
+      </w:r>
+      <w:r>
+        <w:rPr>
+          <w:rFonts w:ascii="Arial" w:cs="Arial" w:eastAsia="Arial" w:hAnsi="Arial"/>
+        </w:rPr>
+        <w:t xml:space="preserve">.</w:t>
+      </w:r>
+    </w:p>
+    <w:p>
+      <w:pPr>
+        <w:pStyle w:val="Heading2"/>
+        <w:keepNext/>
+        <w:spacing w:after="100" w:before="240"/>
+      </w:pPr>
+      <w:r>
+        <w:rPr>
+          <w:rFonts w:ascii="Arial" w:cs="Arial" w:eastAsia="Arial" w:hAnsi="Arial"/>
+          <w:b/>
+          <w:bCs/>
+          <w:color w:val="2B2B2B"/>
+          <w:sz w:val="26"/>
+          <w:szCs w:val="26"/>
+        </w:rPr>
+        <w:t xml:space="preserve">Crear una cuenta</w:t>
+      </w:r>
+    </w:p>
+    <w:p>
+      <w:pPr>
+        <w:pStyle w:val="ListParagraph"/>
+        <w:numPr>
+          <w:ilvl w:val="0"/>
+          <w:numId w:val="8"/>
+        </w:numPr>
+        <w:spacing w:after="80" w:line="270"/>
+      </w:pPr>
+      <w:r>
+        <w:rPr>
+          <w:rFonts w:ascii="Arial" w:cs="Arial" w:eastAsia="Arial" w:hAnsi="Arial"/>
+        </w:rPr>
+        <w:t xml:space="preserve">En la pantalla de inicio, elige registrarte como cliente.</w:t>
+      </w:r>
+    </w:p>
+    <w:p>
+      <w:pPr>
+        <w:pStyle w:val="ListParagraph"/>
+        <w:numPr>
+          <w:ilvl w:val="0"/>
+          <w:numId w:val="8"/>
+        </w:numPr>
+        <w:spacing w:after="80" w:line="270"/>
+      </w:pPr>
+      <w:r>
+        <w:rPr>
+          <w:rFonts w:ascii="Arial" w:cs="Arial" w:eastAsia="Arial" w:hAnsi="Arial"/>
+        </w:rPr>
+        <w:t xml:space="preserve">Escribe tu nombre, correo, teléfono y una contraseña (puedes verla con el ícono del ojito).</w:t>
+      </w:r>
+    </w:p>
+    <w:p>
+      <w:pPr>
+        <w:pStyle w:val="ListParagraph"/>
+        <w:numPr>
+          <w:ilvl w:val="0"/>
+          <w:numId w:val="8"/>
+        </w:numPr>
+        <w:spacing w:after="80" w:line="270"/>
+      </w:pPr>
+      <w:r>
+        <w:rPr>
+          <w:rFonts w:ascii="Arial" w:cs="Arial" w:eastAsia="Arial" w:hAnsi="Arial"/>
+        </w:rPr>
+        <w:t xml:space="preserve">Agrega una foto si quieres. Puedes recortarla, girarla, voltearla y ajustar brillo y contraste.</w:t>
+      </w:r>
+    </w:p>
+    <w:p>
+      <w:pPr>
+        <w:pStyle w:val="ListParagraph"/>
+        <w:numPr>
+          <w:ilvl w:val="0"/>
+          <w:numId w:val="8"/>
         </w:numPr>
         <w:spacing w:after="80" w:line="270"/>
       </w:pPr>
@@ -8272,6 +9866,30 @@
       </w:pPr>
     </w:lvl>
   </w:abstractNum>
+  <w:abstractNum w:abstractNumId="7" w15:restartNumberingAfterBreak="0">
+    <w:multiLevelType w:val="hybridMultilevel"/>
+    <w:lvl w:ilvl="0" w15:tentative="1">
+      <w:start w:val="1"/>
+      <w:numFmt w:val="decimal"/>
+      <w:lvlText w:val="%1."/>
+      <w:lvlJc w:val="left"/>
+      <w:pPr>
+        <w:ind w:left="720" w:hanging="360"/>
+      </w:pPr>
+    </w:lvl>
+  </w:abstractNum>
+  <w:abstractNum w:abstractNumId="8" w15:restartNumberingAfterBreak="0">
+    <w:multiLevelType w:val="hybridMultilevel"/>
+    <w:lvl w:ilvl="0" w15:tentative="1">
+      <w:start w:val="1"/>
+      <w:numFmt w:val="decimal"/>
+      <w:lvlText w:val="%1."/>
+      <w:lvlJc w:val="left"/>
+      <w:pPr>
+        <w:ind w:left="720" w:hanging="360"/>
+      </w:pPr>
+    </w:lvl>
+  </w:abstractNum>
   <w:num w:numId="1">
     <w:abstractNumId w:val="1"/>
     <w:lvlOverride w:ilvl="0">
@@ -8304,6 +9922,18 @@
   </w:num>
   <w:num w:numId="6">
     <w:abstractNumId w:val="6"/>
+    <w:lvlOverride w:ilvl="0">
+      <w:startOverride w:val="1"/>
+    </w:lvlOverride>
+  </w:num>
+  <w:num w:numId="7">
+    <w:abstractNumId w:val="7"/>
+    <w:lvlOverride w:ilvl="0">
+      <w:startOverride w:val="1"/>
+    </w:lvlOverride>
+  </w:num>
+  <w:num w:numId="8">
+    <w:abstractNumId w:val="8"/>
     <w:lvlOverride w:ilvl="0">
       <w:startOverride w:val="1"/>
     </w:lvlOverride>

</xml_diff>

<commit_message>
docs: reportes por mes, PDF con diseno y envio por correo y WhatsApp
</commit_message>
<xml_diff>
--- a/PawOS_Manual_Usuario.docx
+++ b/PawOS_Manual_Usuario.docx
@@ -5438,7 +5438,25 @@
         <w:rPr>
           <w:rFonts w:ascii="Arial" w:cs="Arial" w:eastAsia="Arial" w:hAnsi="Arial"/>
         </w:rPr>
-        <w:t xml:space="preserve">Visible para Administrador y Veterinario. Genera un resumen del refugio: cuántas mascotas hay y en qué estado, vacunas pendientes, adopciones y total recaudado de donantes.</w:t>
+        <w:t xml:space="preserve">Visible para Administrador y Veterinario. Genera resúmenes del refugio: cuántas mascotas hay y en qué estado, vacunas, adopciones, donaciones y alertas.</w:t>
+      </w:r>
+    </w:p>
+    <w:p>
+      <w:pPr>
+        <w:pStyle w:val="Heading2"/>
+        <w:keepNext/>
+        <w:spacing w:after="100" w:before="240"/>
+      </w:pPr>
+      <w:r>
+        <w:rPr>
+          <w:rFonts w:ascii="Arial" w:cs="Arial" w:eastAsia="Arial" w:hAnsi="Arial"/>
+          <w:b/>
+          <w:bCs/>
+          <w:color w:val="2B2B2B"/>
+          <w:sz w:val="26"/>
+          <w:szCs w:val="26"/>
+        </w:rPr>
+        <w:t xml:space="preserve">Qué reportes hay</w:t>
       </w:r>
     </w:p>
     <w:p>
@@ -5453,22 +5471,16 @@
       <w:r>
         <w:rPr>
           <w:rFonts w:ascii="Arial" w:cs="Arial" w:eastAsia="Arial" w:hAnsi="Arial"/>
-        </w:rPr>
-        <w:t xml:space="preserve">Se puede generar por </w:t>
-      </w:r>
-      <w:r>
-        <w:rPr>
-          <w:rFonts w:ascii="Arial" w:cs="Arial" w:eastAsia="Arial" w:hAnsi="Arial"/>
-          <w:b/>
-          <w:bCs/>
-        </w:rPr>
-        <w:t xml:space="preserve">categoría</w:t>
-      </w:r>
-      <w:r>
-        <w:rPr>
-          <w:rFonts w:ascii="Arial" w:cs="Arial" w:eastAsia="Arial" w:hAnsi="Arial"/>
-        </w:rPr>
-        <w:t xml:space="preserve"> (mascotas, vacunas, adopciones, donantes…).</w:t>
+          <w:b/>
+          <w:bCs/>
+        </w:rPr>
+        <w:t xml:space="preserve">Generar reporte</w:t>
+      </w:r>
+      <w:r>
+        <w:rPr>
+          <w:rFonts w:ascii="Arial" w:cs="Arial" w:eastAsia="Arial" w:hAnsi="Arial"/>
+        </w:rPr>
+        <w:t xml:space="preserve">: el resumen general de todo el refugio.</w:t>
       </w:r>
     </w:p>
     <w:p>
@@ -5484,21 +5496,21 @@
         <w:rPr>
           <w:rFonts w:ascii="Arial" w:cs="Arial" w:eastAsia="Arial" w:hAnsi="Arial"/>
         </w:rPr>
-        <w:t xml:space="preserve">Cada reporte generado queda guardado en el </w:t>
-      </w:r>
-      <w:r>
-        <w:rPr>
-          <w:rFonts w:ascii="Arial" w:cs="Arial" w:eastAsia="Arial" w:hAnsi="Arial"/>
-          <w:b/>
-          <w:bCs/>
-        </w:rPr>
-        <w:t xml:space="preserve">historial</w:t>
-      </w:r>
-      <w:r>
-        <w:rPr>
-          <w:rFonts w:ascii="Arial" w:cs="Arial" w:eastAsia="Arial" w:hAnsi="Arial"/>
-        </w:rPr>
-        <w:t xml:space="preserve"> para volver a abrirlo.</w:t>
+        <w:t xml:space="preserve">Reportes por </w:t>
+      </w:r>
+      <w:r>
+        <w:rPr>
+          <w:rFonts w:ascii="Arial" w:cs="Arial" w:eastAsia="Arial" w:hAnsi="Arial"/>
+          <w:b/>
+          <w:bCs/>
+        </w:rPr>
+        <w:t xml:space="preserve">categoría</w:t>
+      </w:r>
+      <w:r>
+        <w:rPr>
+          <w:rFonts w:ascii="Arial" w:cs="Arial" w:eastAsia="Arial" w:hAnsi="Arial"/>
+        </w:rPr>
+        <w:t xml:space="preserve">: Mascotas, Vacunas, Adopciones, Donantes y Alertas de Sensores.</w:t>
       </w:r>
     </w:p>
     <w:p>
@@ -5513,48 +5525,22 @@
       <w:r>
         <w:rPr>
           <w:rFonts w:ascii="Arial" w:cs="Arial" w:eastAsia="Arial" w:hAnsi="Arial"/>
-          <w:b/>
-          <w:bCs/>
-        </w:rPr>
-        <w:t xml:space="preserve">Guardar como</w:t>
-      </w:r>
-      <w:r>
-        <w:rPr>
-          <w:rFonts w:ascii="Arial" w:cs="Arial" w:eastAsia="Arial" w:hAnsi="Arial"/>
-        </w:rPr>
-        <w:t xml:space="preserve">: permite guardarlo como archivo de texto (.txt) o como </w:t>
-      </w:r>
-      <w:r>
-        <w:rPr>
-          <w:rFonts w:ascii="Arial" w:cs="Arial" w:eastAsia="Arial" w:hAnsi="Arial"/>
-          <w:b/>
-          <w:bCs/>
-        </w:rPr>
-        <w:t xml:space="preserve">PDF</w:t>
-      </w:r>
-      <w:r>
-        <w:rPr>
-          <w:rFonts w:ascii="Arial" w:cs="Arial" w:eastAsia="Arial" w:hAnsi="Arial"/>
-        </w:rPr>
-        <w:t xml:space="preserve"> con diseño, eligiendo dónde guardarlo.</w:t>
-      </w:r>
-    </w:p>
-    <w:p>
-      <w:pPr>
-        <w:pStyle w:val="Heading1"/>
-        <w:keepNext/>
-        <w:spacing w:after="160" w:before="360"/>
-      </w:pPr>
-      <w:r>
-        <w:rPr>
-          <w:rFonts w:ascii="Arial" w:cs="Arial" w:eastAsia="Arial" w:hAnsi="Arial"/>
-          <w:b/>
-          <w:bCs/>
-          <w:color w:val="1D7A3E"/>
-          <w:sz w:val="32"/>
-          <w:szCs w:val="32"/>
-        </w:rPr>
-        <w:t xml:space="preserve">10. Administración (solo Administrador)</w:t>
+        </w:rPr>
+        <w:t xml:space="preserve">Cada reporte generado queda guardado en el </w:t>
+      </w:r>
+      <w:r>
+        <w:rPr>
+          <w:rFonts w:ascii="Arial" w:cs="Arial" w:eastAsia="Arial" w:hAnsi="Arial"/>
+          <w:b/>
+          <w:bCs/>
+        </w:rPr>
+        <w:t xml:space="preserve">historial</w:t>
+      </w:r>
+      <w:r>
+        <w:rPr>
+          <w:rFonts w:ascii="Arial" w:cs="Arial" w:eastAsia="Arial" w:hAnsi="Arial"/>
+        </w:rPr>
+        <w:t xml:space="preserve"> para volver a abrirlo.</w:t>
       </w:r>
     </w:p>
     <w:p>
@@ -5572,7 +5558,7 @@
           <w:sz w:val="26"/>
           <w:szCs w:val="26"/>
         </w:rPr>
-        <w:t xml:space="preserve">Administrar Colaboradores</w:t>
+        <w:t xml:space="preserve">Reportes por mes</w:t>
       </w:r>
     </w:p>
     <w:p>
@@ -5583,7 +5569,154 @@
         <w:rPr>
           <w:rFonts w:ascii="Arial" w:cs="Arial" w:eastAsia="Arial" w:hAnsi="Arial"/>
         </w:rPr>
-        <w:t xml:space="preserve">Aquí se crean las cuentas del personal.</w:t>
+        <w:t xml:space="preserve">Al pulsar </w:t>
+      </w:r>
+      <w:r>
+        <w:rPr>
+          <w:rFonts w:ascii="Arial" w:cs="Arial" w:eastAsia="Arial" w:hAnsi="Arial"/>
+          <w:b/>
+          <w:bCs/>
+        </w:rPr>
+        <w:t xml:space="preserve">Donantes</w:t>
+      </w:r>
+      <w:r>
+        <w:rPr>
+          <w:rFonts w:ascii="Arial" w:cs="Arial" w:eastAsia="Arial" w:hAnsi="Arial"/>
+        </w:rPr>
+        <w:t xml:space="preserve">, </w:t>
+      </w:r>
+      <w:r>
+        <w:rPr>
+          <w:rFonts w:ascii="Arial" w:cs="Arial" w:eastAsia="Arial" w:hAnsi="Arial"/>
+          <w:b/>
+          <w:bCs/>
+        </w:rPr>
+        <w:t xml:space="preserve">Vacunas</w:t>
+      </w:r>
+      <w:r>
+        <w:rPr>
+          <w:rFonts w:ascii="Arial" w:cs="Arial" w:eastAsia="Arial" w:hAnsi="Arial"/>
+        </w:rPr>
+        <w:t xml:space="preserve">, </w:t>
+      </w:r>
+      <w:r>
+        <w:rPr>
+          <w:rFonts w:ascii="Arial" w:cs="Arial" w:eastAsia="Arial" w:hAnsi="Arial"/>
+          <w:b/>
+          <w:bCs/>
+        </w:rPr>
+        <w:t xml:space="preserve">Adopciones</w:t>
+      </w:r>
+      <w:r>
+        <w:rPr>
+          <w:rFonts w:ascii="Arial" w:cs="Arial" w:eastAsia="Arial" w:hAnsi="Arial"/>
+        </w:rPr>
+        <w:t xml:space="preserve"> o </w:t>
+      </w:r>
+      <w:r>
+        <w:rPr>
+          <w:rFonts w:ascii="Arial" w:cs="Arial" w:eastAsia="Arial" w:hAnsi="Arial"/>
+          <w:b/>
+          <w:bCs/>
+        </w:rPr>
+        <w:t xml:space="preserve">Alertas de Sensores</w:t>
+      </w:r>
+      <w:r>
+        <w:rPr>
+          <w:rFonts w:ascii="Arial" w:cs="Arial" w:eastAsia="Arial" w:hAnsi="Arial"/>
+        </w:rPr>
+        <w:t xml:space="preserve">, PawOS pregunta de qué mes quieres el reporte. La lista muestra los últimos 12 meses (con mes y año) y también cualquier mes anterior que tenga registros. Así no se mezclan los meses.</w:t>
+      </w:r>
+    </w:p>
+    <w:p>
+      <w:pPr>
+        <w:pStyle w:val="ListParagraph"/>
+        <w:numPr>
+          <w:ilvl w:val="0"/>
+          <w:numId w:val="3"/>
+        </w:numPr>
+        <w:spacing w:after="80" w:line="270"/>
+      </w:pPr>
+      <w:r>
+        <w:rPr>
+          <w:rFonts w:ascii="Arial" w:cs="Arial" w:eastAsia="Arial" w:hAnsi="Arial"/>
+          <w:b/>
+          <w:bCs/>
+        </w:rPr>
+        <w:t xml:space="preserve">Un mes</w:t>
+      </w:r>
+      <w:r>
+        <w:rPr>
+          <w:rFonts w:ascii="Arial" w:cs="Arial" w:eastAsia="Arial" w:hAnsi="Arial"/>
+        </w:rPr>
+        <w:t xml:space="preserve"> (por ejemplo, Octubre 2026): el reporte trae solo ese mes y su total. Si el mes no tiene registros, el reporte lo indica.</w:t>
+      </w:r>
+    </w:p>
+    <w:p>
+      <w:pPr>
+        <w:pStyle w:val="ListParagraph"/>
+        <w:numPr>
+          <w:ilvl w:val="0"/>
+          <w:numId w:val="3"/>
+        </w:numPr>
+        <w:spacing w:after="80" w:line="270"/>
+      </w:pPr>
+      <w:r>
+        <w:rPr>
+          <w:rFonts w:ascii="Arial" w:cs="Arial" w:eastAsia="Arial" w:hAnsi="Arial"/>
+          <w:b/>
+          <w:bCs/>
+        </w:rPr>
+        <w:t xml:space="preserve">Todos los meses</w:t>
+      </w:r>
+      <w:r>
+        <w:rPr>
+          <w:rFonts w:ascii="Arial" w:cs="Arial" w:eastAsia="Arial" w:hAnsi="Arial"/>
+        </w:rPr>
+        <w:t xml:space="preserve">: el reporte trae toda la categoría, agrupada por mes, con un subtotal en cada mes y un total general al final.</w:t>
+      </w:r>
+    </w:p>
+    <w:p>
+      <w:pPr>
+        <w:spacing w:after="120" w:line="276"/>
+      </w:pPr>
+      <w:r>
+        <w:rPr>
+          <w:rFonts w:ascii="Arial" w:cs="Arial" w:eastAsia="Arial" w:hAnsi="Arial"/>
+        </w:rPr>
+        <w:t xml:space="preserve">Cada reporte usa su propia fecha: las vacunas por la fecha en que se aplicaron, las adopciones por la fecha de adopción, las donaciones por la fecha de la donación y las alertas por la fecha en que llegaron (y se indica cuántas siguen pendientes). </w:t>
+      </w:r>
+      <w:r>
+        <w:rPr>
+          <w:rFonts w:ascii="Arial" w:cs="Arial" w:eastAsia="Arial" w:hAnsi="Arial"/>
+          <w:b/>
+          <w:bCs/>
+        </w:rPr>
+        <w:t xml:space="preserve">Mascotas</w:t>
+      </w:r>
+      <w:r>
+        <w:rPr>
+          <w:rFonts w:ascii="Arial" w:cs="Arial" w:eastAsia="Arial" w:hAnsi="Arial"/>
+        </w:rPr>
+        <w:t xml:space="preserve"> no pregunta el mes, porque muestra el estado actual de todas las mascotas.</w:t>
+      </w:r>
+    </w:p>
+    <w:p>
+      <w:pPr>
+        <w:pStyle w:val="Heading2"/>
+        <w:keepNext/>
+        <w:spacing w:after="100" w:before="240"/>
+      </w:pPr>
+      <w:r>
+        <w:rPr>
+          <w:rFonts w:ascii="Arial" w:cs="Arial" w:eastAsia="Arial" w:hAnsi="Arial"/>
+          <w:b/>
+          <w:bCs/>
+          <w:color w:val="2B2B2B"/>
+          <w:sz w:val="26"/>
+          <w:szCs w:val="26"/>
+        </w:rPr>
+        <w:t xml:space="preserve">Guardar el reporte en PDF</w:t>
       </w:r>
     </w:p>
     <w:p>
@@ -5599,21 +5732,7 @@
         <w:rPr>
           <w:rFonts w:ascii="Arial" w:cs="Arial" w:eastAsia="Arial" w:hAnsi="Arial"/>
         </w:rPr>
-        <w:t xml:space="preserve">Abre </w:t>
-      </w:r>
-      <w:r>
-        <w:rPr>
-          <w:rFonts w:ascii="Arial" w:cs="Arial" w:eastAsia="Arial" w:hAnsi="Arial"/>
-          <w:b/>
-          <w:bCs/>
-        </w:rPr>
-        <w:t xml:space="preserve">Administrar Colaboradores</w:t>
-      </w:r>
-      <w:r>
-        <w:rPr>
-          <w:rFonts w:ascii="Arial" w:cs="Arial" w:eastAsia="Arial" w:hAnsi="Arial"/>
-        </w:rPr>
-        <w:t xml:space="preserve"> en el menú lateral.</w:t>
+        <w:t xml:space="preserve">Genera el reporte que necesitas.</w:t>
       </w:r>
     </w:p>
     <w:p>
@@ -5637,7 +5756,7 @@
           <w:b/>
           <w:bCs/>
         </w:rPr>
-        <w:t xml:space="preserve">+ Agregar Colaborador</w:t>
+        <w:t xml:space="preserve">Guardar como (.txt / .pdf)...</w:t>
       </w:r>
       <w:r>
         <w:rPr>
@@ -5659,7 +5778,36 @@
         <w:rPr>
           <w:rFonts w:ascii="Arial" w:cs="Arial" w:eastAsia="Arial" w:hAnsi="Arial"/>
         </w:rPr>
-        <w:t xml:space="preserve">Escribe el usuario y la contraseña, elige el rol (Veterinario, Voluntario, Rescatista, Recepcionista u otro Administrador) y, si quieres, una foto.</w:t>
+        <w:t xml:space="preserve">Elige el formato (PDF o texto), la carpeta y el nombre, y guarda.</w:t>
+      </w:r>
+    </w:p>
+    <w:p>
+      <w:pPr>
+        <w:spacing w:after="120" w:line="276"/>
+      </w:pPr>
+      <w:r>
+        <w:rPr>
+          <w:rFonts w:ascii="Arial" w:cs="Arial" w:eastAsia="Arial" w:hAnsi="Arial"/>
+        </w:rPr>
+        <w:t xml:space="preserve">El PDF tiene un encabezado verde con el nombre del refugio, el periodo, tarjetas con los totales, una tabla por mes con sus subtotales, el total final y el número de página.</w:t>
+      </w:r>
+    </w:p>
+    <w:p>
+      <w:pPr>
+        <w:pStyle w:val="Heading2"/>
+        <w:keepNext/>
+        <w:spacing w:after="100" w:before="240"/>
+      </w:pPr>
+      <w:r>
+        <w:rPr>
+          <w:rFonts w:ascii="Arial" w:cs="Arial" w:eastAsia="Arial" w:hAnsi="Arial"/>
+          <w:b/>
+          <w:bCs/>
+          <w:color w:val="2B2B2B"/>
+          <w:sz w:val="26"/>
+          <w:szCs w:val="26"/>
+        </w:rPr>
+        <w:t xml:space="preserve">Enviar el reporte por correo o WhatsApp</w:t>
       </w:r>
     </w:p>
     <w:p>
@@ -5667,7 +5815,284 @@
         <w:pStyle w:val="ListParagraph"/>
         <w:numPr>
           <w:ilvl w:val="0"/>
-          <w:numId w:val="4"/>
+          <w:numId w:val="5"/>
+        </w:numPr>
+        <w:spacing w:after="80" w:line="270"/>
+      </w:pPr>
+      <w:r>
+        <w:rPr>
+          <w:rFonts w:ascii="Arial" w:cs="Arial" w:eastAsia="Arial" w:hAnsi="Arial"/>
+        </w:rPr>
+        <w:t xml:space="preserve">Genera el reporte (y elige el mes, si te lo pregunta).</w:t>
+      </w:r>
+    </w:p>
+    <w:p>
+      <w:pPr>
+        <w:pStyle w:val="ListParagraph"/>
+        <w:numPr>
+          <w:ilvl w:val="0"/>
+          <w:numId w:val="5"/>
+        </w:numPr>
+        <w:spacing w:after="80" w:line="270"/>
+      </w:pPr>
+      <w:r>
+        <w:rPr>
+          <w:rFonts w:ascii="Arial" w:cs="Arial" w:eastAsia="Arial" w:hAnsi="Arial"/>
+        </w:rPr>
+        <w:t xml:space="preserve">Pulsa </w:t>
+      </w:r>
+      <w:r>
+        <w:rPr>
+          <w:rFonts w:ascii="Arial" w:cs="Arial" w:eastAsia="Arial" w:hAnsi="Arial"/>
+          <w:b/>
+          <w:bCs/>
+        </w:rPr>
+        <w:t xml:space="preserve">Enviar por correo</w:t>
+      </w:r>
+      <w:r>
+        <w:rPr>
+          <w:rFonts w:ascii="Arial" w:cs="Arial" w:eastAsia="Arial" w:hAnsi="Arial"/>
+        </w:rPr>
+        <w:t xml:space="preserve"> o </w:t>
+      </w:r>
+      <w:r>
+        <w:rPr>
+          <w:rFonts w:ascii="Arial" w:cs="Arial" w:eastAsia="Arial" w:hAnsi="Arial"/>
+          <w:b/>
+          <w:bCs/>
+        </w:rPr>
+        <w:t xml:space="preserve">Enviar por WhatsApp</w:t>
+      </w:r>
+      <w:r>
+        <w:rPr>
+          <w:rFonts w:ascii="Arial" w:cs="Arial" w:eastAsia="Arial" w:hAnsi="Arial"/>
+        </w:rPr>
+        <w:t xml:space="preserve">.</w:t>
+      </w:r>
+    </w:p>
+    <w:p>
+      <w:pPr>
+        <w:pStyle w:val="ListParagraph"/>
+        <w:numPr>
+          <w:ilvl w:val="0"/>
+          <w:numId w:val="5"/>
+        </w:numPr>
+        <w:spacing w:after="80" w:line="270"/>
+      </w:pPr>
+      <w:r>
+        <w:rPr>
+          <w:rFonts w:ascii="Arial" w:cs="Arial" w:eastAsia="Arial" w:hAnsi="Arial"/>
+        </w:rPr>
+        <w:t xml:space="preserve">Escribe el correo o el número de destino y pulsa </w:t>
+      </w:r>
+      <w:r>
+        <w:rPr>
+          <w:rFonts w:ascii="Arial" w:cs="Arial" w:eastAsia="Arial" w:hAnsi="Arial"/>
+          <w:b/>
+          <w:bCs/>
+        </w:rPr>
+        <w:t xml:space="preserve">Enviar</w:t>
+      </w:r>
+      <w:r>
+        <w:rPr>
+          <w:rFonts w:ascii="Arial" w:cs="Arial" w:eastAsia="Arial" w:hAnsi="Arial"/>
+        </w:rPr>
+        <w:t xml:space="preserve">.</w:t>
+      </w:r>
+    </w:p>
+    <w:p>
+      <w:pPr>
+        <w:spacing w:after="120" w:line="276"/>
+      </w:pPr>
+      <w:r>
+        <w:rPr>
+          <w:rFonts w:ascii="Arial" w:cs="Arial" w:eastAsia="Arial" w:hAnsi="Arial"/>
+        </w:rPr>
+        <w:t xml:space="preserve">PawOS arma el PDF y lo manda como archivo adjunto. Se envía exactamente el reporte que ves en pantalla; para mandar una categoría completa, elige </w:t>
+      </w:r>
+      <w:r>
+        <w:rPr>
+          <w:rFonts w:ascii="Arial" w:cs="Arial" w:eastAsia="Arial" w:hAnsi="Arial"/>
+          <w:b/>
+          <w:bCs/>
+        </w:rPr>
+        <w:t xml:space="preserve">Todos los meses</w:t>
+      </w:r>
+      <w:r>
+        <w:rPr>
+          <w:rFonts w:ascii="Arial" w:cs="Arial" w:eastAsia="Arial" w:hAnsi="Arial"/>
+        </w:rPr>
+        <w:t xml:space="preserve">.</w:t>
+      </w:r>
+    </w:p>
+    <w:p>
+      <w:pPr>
+        <w:pBdr>
+          <w:left w:val="single" w:color="1D7A3E" w:sz="18" w:space="8"/>
+        </w:pBdr>
+        <w:shd w:fill="E8F5EC" w:val="clear"/>
+        <w:spacing w:after="160" w:before="120" w:line="270"/>
+        <w:ind w:left="200" w:right="100"/>
+      </w:pPr>
+      <w:r>
+        <w:rPr>
+          <w:rFonts w:ascii="Arial" w:cs="Arial" w:eastAsia="Arial" w:hAnsi="Arial"/>
+          <w:b/>
+          <w:bCs/>
+          <w:color w:val="1D7A3E"/>
+        </w:rPr>
+        <w:t xml:space="preserve">Dato útil: </w:t>
+      </w:r>
+      <w:r>
+        <w:rPr>
+          <w:rFonts w:ascii="Arial" w:cs="Arial" w:eastAsia="Arial" w:hAnsi="Arial"/>
+        </w:rPr>
+        <w:t xml:space="preserve">Si el número de WhatsApp tiene 8 dígitos, PawOS le agrega el código de Guatemala (502) automáticamente. Los botones de enviar usan las mismas credenciales que </w:t>
+      </w:r>
+      <w:r>
+        <w:rPr>
+          <w:rFonts w:ascii="Arial" w:cs="Arial" w:eastAsia="Arial" w:hAnsi="Arial"/>
+          <w:b/>
+          <w:bCs/>
+        </w:rPr>
+        <w:t xml:space="preserve">Configurar Notificaciones</w:t>
+      </w:r>
+      <w:r>
+        <w:rPr>
+          <w:rFonts w:ascii="Arial" w:cs="Arial" w:eastAsia="Arial" w:hAnsi="Arial"/>
+        </w:rPr>
+        <w:t xml:space="preserve">, así que esa configuración debe estar completa.</w:t>
+      </w:r>
+    </w:p>
+    <w:p>
+      <w:pPr>
+        <w:pStyle w:val="Heading1"/>
+        <w:keepNext/>
+        <w:spacing w:after="160" w:before="360"/>
+      </w:pPr>
+      <w:r>
+        <w:rPr>
+          <w:rFonts w:ascii="Arial" w:cs="Arial" w:eastAsia="Arial" w:hAnsi="Arial"/>
+          <w:b/>
+          <w:bCs/>
+          <w:color w:val="1D7A3E"/>
+          <w:sz w:val="32"/>
+          <w:szCs w:val="32"/>
+        </w:rPr>
+        <w:t xml:space="preserve">10. Administración (solo Administrador)</w:t>
+      </w:r>
+    </w:p>
+    <w:p>
+      <w:pPr>
+        <w:pStyle w:val="Heading2"/>
+        <w:keepNext/>
+        <w:spacing w:after="100" w:before="240"/>
+      </w:pPr>
+      <w:r>
+        <w:rPr>
+          <w:rFonts w:ascii="Arial" w:cs="Arial" w:eastAsia="Arial" w:hAnsi="Arial"/>
+          <w:b/>
+          <w:bCs/>
+          <w:color w:val="2B2B2B"/>
+          <w:sz w:val="26"/>
+          <w:szCs w:val="26"/>
+        </w:rPr>
+        <w:t xml:space="preserve">Administrar Colaboradores</w:t>
+      </w:r>
+    </w:p>
+    <w:p>
+      <w:pPr>
+        <w:spacing w:after="120" w:line="276"/>
+      </w:pPr>
+      <w:r>
+        <w:rPr>
+          <w:rFonts w:ascii="Arial" w:cs="Arial" w:eastAsia="Arial" w:hAnsi="Arial"/>
+        </w:rPr>
+        <w:t xml:space="preserve">Aquí se crean las cuentas del personal.</w:t>
+      </w:r>
+    </w:p>
+    <w:p>
+      <w:pPr>
+        <w:pStyle w:val="ListParagraph"/>
+        <w:numPr>
+          <w:ilvl w:val="0"/>
+          <w:numId w:val="6"/>
+        </w:numPr>
+        <w:spacing w:after="80" w:line="270"/>
+      </w:pPr>
+      <w:r>
+        <w:rPr>
+          <w:rFonts w:ascii="Arial" w:cs="Arial" w:eastAsia="Arial" w:hAnsi="Arial"/>
+        </w:rPr>
+        <w:t xml:space="preserve">Abre </w:t>
+      </w:r>
+      <w:r>
+        <w:rPr>
+          <w:rFonts w:ascii="Arial" w:cs="Arial" w:eastAsia="Arial" w:hAnsi="Arial"/>
+          <w:b/>
+          <w:bCs/>
+        </w:rPr>
+        <w:t xml:space="preserve">Administrar Colaboradores</w:t>
+      </w:r>
+      <w:r>
+        <w:rPr>
+          <w:rFonts w:ascii="Arial" w:cs="Arial" w:eastAsia="Arial" w:hAnsi="Arial"/>
+        </w:rPr>
+        <w:t xml:space="preserve"> en el menú lateral.</w:t>
+      </w:r>
+    </w:p>
+    <w:p>
+      <w:pPr>
+        <w:pStyle w:val="ListParagraph"/>
+        <w:numPr>
+          <w:ilvl w:val="0"/>
+          <w:numId w:val="6"/>
+        </w:numPr>
+        <w:spacing w:after="80" w:line="270"/>
+      </w:pPr>
+      <w:r>
+        <w:rPr>
+          <w:rFonts w:ascii="Arial" w:cs="Arial" w:eastAsia="Arial" w:hAnsi="Arial"/>
+        </w:rPr>
+        <w:t xml:space="preserve">Pulsa </w:t>
+      </w:r>
+      <w:r>
+        <w:rPr>
+          <w:rFonts w:ascii="Arial" w:cs="Arial" w:eastAsia="Arial" w:hAnsi="Arial"/>
+          <w:b/>
+          <w:bCs/>
+        </w:rPr>
+        <w:t xml:space="preserve">+ Agregar Colaborador</w:t>
+      </w:r>
+      <w:r>
+        <w:rPr>
+          <w:rFonts w:ascii="Arial" w:cs="Arial" w:eastAsia="Arial" w:hAnsi="Arial"/>
+        </w:rPr>
+        <w:t xml:space="preserve">.</w:t>
+      </w:r>
+    </w:p>
+    <w:p>
+      <w:pPr>
+        <w:pStyle w:val="ListParagraph"/>
+        <w:numPr>
+          <w:ilvl w:val="0"/>
+          <w:numId w:val="6"/>
+        </w:numPr>
+        <w:spacing w:after="80" w:line="270"/>
+      </w:pPr>
+      <w:r>
+        <w:rPr>
+          <w:rFonts w:ascii="Arial" w:cs="Arial" w:eastAsia="Arial" w:hAnsi="Arial"/>
+        </w:rPr>
+        <w:t xml:space="preserve">Escribe el usuario y la contraseña, elige el rol (Veterinario, Voluntario, Rescatista, Recepcionista u otro Administrador) y, si quieres, una foto.</w:t>
+      </w:r>
+    </w:p>
+    <w:p>
+      <w:pPr>
+        <w:pStyle w:val="ListParagraph"/>
+        <w:numPr>
+          <w:ilvl w:val="0"/>
+          <w:numId w:val="6"/>
         </w:numPr>
         <w:spacing w:after="80" w:line="270"/>
       </w:pPr>
@@ -6164,7 +6589,7 @@
         <w:pStyle w:val="ListParagraph"/>
         <w:numPr>
           <w:ilvl w:val="0"/>
-          <w:numId w:val="5"/>
+          <w:numId w:val="7"/>
         </w:numPr>
         <w:spacing w:after="80" w:line="270"/>
       </w:pPr>
@@ -6180,7 +6605,7 @@
         <w:pStyle w:val="ListParagraph"/>
         <w:numPr>
           <w:ilvl w:val="0"/>
-          <w:numId w:val="5"/>
+          <w:numId w:val="7"/>
         </w:numPr>
         <w:spacing w:after="80" w:line="270"/>
       </w:pPr>
@@ -6210,7 +6635,7 @@
         <w:pStyle w:val="ListParagraph"/>
         <w:numPr>
           <w:ilvl w:val="0"/>
-          <w:numId w:val="5"/>
+          <w:numId w:val="7"/>
         </w:numPr>
         <w:spacing w:after="80" w:line="270"/>
       </w:pPr>
@@ -6226,7 +6651,7 @@
         <w:pStyle w:val="ListParagraph"/>
         <w:numPr>
           <w:ilvl w:val="0"/>
-          <w:numId w:val="5"/>
+          <w:numId w:val="7"/>
         </w:numPr>
         <w:spacing w:after="80" w:line="270"/>
       </w:pPr>
@@ -7148,7 +7573,7 @@
         <w:pStyle w:val="ListParagraph"/>
         <w:numPr>
           <w:ilvl w:val="0"/>
-          <w:numId w:val="6"/>
+          <w:numId w:val="8"/>
         </w:numPr>
         <w:spacing w:after="80" w:line="270"/>
       </w:pPr>
@@ -7178,7 +7603,7 @@
         <w:pStyle w:val="ListParagraph"/>
         <w:numPr>
           <w:ilvl w:val="0"/>
-          <w:numId w:val="6"/>
+          <w:numId w:val="8"/>
         </w:numPr>
         <w:spacing w:after="80" w:line="270"/>
       </w:pPr>
@@ -7194,7 +7619,7 @@
         <w:pStyle w:val="ListParagraph"/>
         <w:numPr>
           <w:ilvl w:val="0"/>
-          <w:numId w:val="6"/>
+          <w:numId w:val="8"/>
         </w:numPr>
         <w:spacing w:after="80" w:line="270"/>
       </w:pPr>
@@ -7224,7 +7649,7 @@
         <w:pStyle w:val="ListParagraph"/>
         <w:numPr>
           <w:ilvl w:val="0"/>
-          <w:numId w:val="6"/>
+          <w:numId w:val="8"/>
         </w:numPr>
         <w:spacing w:after="80" w:line="270"/>
       </w:pPr>
@@ -7240,7 +7665,7 @@
         <w:pStyle w:val="ListParagraph"/>
         <w:numPr>
           <w:ilvl w:val="0"/>
-          <w:numId w:val="6"/>
+          <w:numId w:val="8"/>
         </w:numPr>
         <w:spacing w:after="80" w:line="270"/>
       </w:pPr>
@@ -7860,7 +8285,7 @@
         <w:pStyle w:val="ListParagraph"/>
         <w:numPr>
           <w:ilvl w:val="0"/>
-          <w:numId w:val="7"/>
+          <w:numId w:val="9"/>
         </w:numPr>
         <w:spacing w:after="80" w:line="270"/>
       </w:pPr>
@@ -7890,7 +8315,7 @@
         <w:pStyle w:val="ListParagraph"/>
         <w:numPr>
           <w:ilvl w:val="0"/>
-          <w:numId w:val="7"/>
+          <w:numId w:val="9"/>
         </w:numPr>
         <w:spacing w:after="80" w:line="270"/>
       </w:pPr>
@@ -7920,7 +8345,7 @@
         <w:pStyle w:val="ListParagraph"/>
         <w:numPr>
           <w:ilvl w:val="0"/>
-          <w:numId w:val="7"/>
+          <w:numId w:val="9"/>
         </w:numPr>
         <w:spacing w:after="80" w:line="270"/>
       </w:pPr>
@@ -7936,7 +8361,7 @@
         <w:pStyle w:val="ListParagraph"/>
         <w:numPr>
           <w:ilvl w:val="0"/>
-          <w:numId w:val="7"/>
+          <w:numId w:val="9"/>
         </w:numPr>
         <w:spacing w:after="80" w:line="270"/>
       </w:pPr>
@@ -7980,7 +8405,7 @@
         <w:pStyle w:val="ListParagraph"/>
         <w:numPr>
           <w:ilvl w:val="0"/>
-          <w:numId w:val="7"/>
+          <w:numId w:val="9"/>
         </w:numPr>
         <w:spacing w:after="80" w:line="270"/>
       </w:pPr>
@@ -8171,7 +8596,7 @@
         <w:pStyle w:val="ListParagraph"/>
         <w:numPr>
           <w:ilvl w:val="0"/>
-          <w:numId w:val="8"/>
+          <w:numId w:val="10"/>
         </w:numPr>
         <w:spacing w:after="80" w:line="270"/>
       </w:pPr>
@@ -8187,7 +8612,7 @@
         <w:pStyle w:val="ListParagraph"/>
         <w:numPr>
           <w:ilvl w:val="0"/>
-          <w:numId w:val="8"/>
+          <w:numId w:val="10"/>
         </w:numPr>
         <w:spacing w:after="80" w:line="270"/>
       </w:pPr>
@@ -8203,7 +8628,7 @@
         <w:pStyle w:val="ListParagraph"/>
         <w:numPr>
           <w:ilvl w:val="0"/>
-          <w:numId w:val="8"/>
+          <w:numId w:val="10"/>
         </w:numPr>
         <w:spacing w:after="80" w:line="270"/>
       </w:pPr>
@@ -8219,7 +8644,7 @@
         <w:pStyle w:val="ListParagraph"/>
         <w:numPr>
           <w:ilvl w:val="0"/>
-          <w:numId w:val="8"/>
+          <w:numId w:val="10"/>
         </w:numPr>
         <w:spacing w:after="80" w:line="270"/>
       </w:pPr>
@@ -9879,6 +10304,30 @@
     </w:lvl>
   </w:abstractNum>
   <w:abstractNum w:abstractNumId="8" w15:restartNumberingAfterBreak="0">
+    <w:multiLevelType w:val="hybridMultilevel"/>
+    <w:lvl w:ilvl="0" w15:tentative="1">
+      <w:start w:val="1"/>
+      <w:numFmt w:val="decimal"/>
+      <w:lvlText w:val="%1."/>
+      <w:lvlJc w:val="left"/>
+      <w:pPr>
+        <w:ind w:left="720" w:hanging="360"/>
+      </w:pPr>
+    </w:lvl>
+  </w:abstractNum>
+  <w:abstractNum w:abstractNumId="9" w15:restartNumberingAfterBreak="0">
+    <w:multiLevelType w:val="hybridMultilevel"/>
+    <w:lvl w:ilvl="0" w15:tentative="1">
+      <w:start w:val="1"/>
+      <w:numFmt w:val="decimal"/>
+      <w:lvlText w:val="%1."/>
+      <w:lvlJc w:val="left"/>
+      <w:pPr>
+        <w:ind w:left="720" w:hanging="360"/>
+      </w:pPr>
+    </w:lvl>
+  </w:abstractNum>
+  <w:abstractNum w:abstractNumId="10" w15:restartNumberingAfterBreak="0">
     <w:multiLevelType w:val="hybridMultilevel"/>
     <w:lvl w:ilvl="0" w15:tentative="1">
       <w:start w:val="1"/>
@@ -9934,6 +10383,18 @@
   </w:num>
   <w:num w:numId="8">
     <w:abstractNumId w:val="8"/>
+    <w:lvlOverride w:ilvl="0">
+      <w:startOverride w:val="1"/>
+    </w:lvlOverride>
+  </w:num>
+  <w:num w:numId="9">
+    <w:abstractNumId w:val="9"/>
+    <w:lvlOverride w:ilvl="0">
+      <w:startOverride w:val="1"/>
+    </w:lvlOverride>
+  </w:num>
+  <w:num w:numId="10">
+    <w:abstractNumId w:val="10"/>
     <w:lvlOverride w:ilvl="0">
       <w:startOverride w:val="1"/>
     </w:lvlOverride>

</xml_diff>